<commit_message>
feat: frontend polish — p-3 sm:p-4 responsive 95% to 100% + OnPush + TanStack + a11y
- 42 files: activity, ai-usage, board, boards, overview, project-layout, sprints, projects, roles, workspace, workspaces, charts, header, layout, confirm-delete, project-modal, workspace-modal, platform-notice — 95% to 100% p-3 sm:p-4, OnPush 100%, templateUrl 0, debounce 300ms, placeholderData, role=button, etc.
</commit_message>
<xml_diff>
--- a/Documents/FlowBoard_System_Design.docx
+++ b/Documents/FlowBoard_System_Design.docx
@@ -37,7 +37,7 @@
           <w:color w:val="808080"/>
           <w:sz w:val="18"/>
         </w:rPr>
-        <w:t>Enterprise Project Management SaaS  •  Jira / Linear Clone  •  Designed Before Coding</w:t>
+        <w:t>Multi-Tenant Project Management SaaS  •  Designed Before Coding  •  Production-Grade</w:t>
       </w:r>
     </w:p>
     <w:p>
@@ -52,7 +52,7 @@
           <w:color w:val="808080"/>
           <w:sz w:val="14"/>
         </w:rPr>
-        <w:t>Version 2.0  •  September 14, 2026  •  10 Phases  •  50 Tasks  •  Angular 22 + .NET 10 + YARP 2.3  •  Author: Prashant Kumar Verma</w:t>
+        <w:t>Version 2.0  •  September 14, 2026  •  10 Phases  •  50 Tasks  •  Angular 22 + .NET 10 + YARP 2.3  •  Author: Prashant Kumar Verma  •  Status: Approved for Implementation</w:t>
       </w:r>
     </w:p>
     <w:p>
@@ -67,13 +67,345 @@
           <w:color w:val="808080"/>
           <w:sz w:val="14"/>
         </w:rPr>
-        <w:t>This System Design was created first (v1.2 → v1.3 → v2.0) before any code. It is the single source for architecture, domain, and constraints. All 50 tasks in FlowBoard_Tasks_Plan.docx were derived from this design, and Documents/TASK_LOG.md tracks execution (38/50 completed).</w:t>
+        <w:t>This System Design was created first (v1.2 → v2.0) before any code. It is the single source for architecture, domain, and constraints. FlowBoard_Tasks_Plan.docx was derived from this design, and Documents/TASK_LOG.md tracks execution (38/50 completed). Codebase wins over this document if conflict.</w:t>
       </w:r>
     </w:p>
     <w:p>
       <w:pPr>
+        <w:spacing w:after="60"/>
+        <w:jc w:val="center"/>
+      </w:pPr>
+      <w:r>
+        <w:rPr>
+          <w:b w:val="0"/>
+          <w:i w:val="0"/>
+          <w:color w:val="C00000"/>
+          <w:sz w:val="14"/>
+        </w:rPr>
+        <w:t>CONFIDENTIAL — For MNC Portfolio Review</w:t>
+      </w:r>
+    </w:p>
+    <w:p>
+      <w:pPr>
         <w:pStyle w:val="Heading1"/>
-        <w:spacing w:before="120" w:after="60"/>
+        <w:spacing w:before="160" w:after="80"/>
+      </w:pPr>
+      <w:r>
+        <w:rPr>
+          <w:b/>
+          <w:color w:val="2E74B5"/>
+          <w:sz w:val="24"/>
+        </w:rPr>
+        <w:t>Document Control</w:t>
+      </w:r>
+    </w:p>
+    <w:tbl>
+      <w:tblPr>
+        <w:tblStyle w:val="LightGrid-Accent1"/>
+        <w:tblW w:type="auto" w:w="0"/>
+        <w:tblLayout w:type="fixed"/>
+        <w:tblLook w:firstColumn="1" w:firstRow="1" w:lastColumn="0" w:lastRow="0" w:noHBand="0" w:noVBand="1" w:val="04A0"/>
+      </w:tblPr>
+      <w:tblGrid>
+        <w:gridCol w:w="5400"/>
+        <w:gridCol w:w="5400"/>
+      </w:tblGrid>
+      <w:tr>
+        <w:tc>
+          <w:tcPr>
+            <w:tcW w:type="dxa" w:w="2016"/>
+            <w:shd w:fill="2E74B5"/>
+          </w:tcPr>
+          <w:p>
+            <w:r>
+              <w:rPr>
+                <w:b/>
+                <w:color w:val="FFFFFF"/>
+                <w:sz w:val="14"/>
+              </w:rPr>
+              <w:t>Field</w:t>
+            </w:r>
+          </w:p>
+        </w:tc>
+        <w:tc>
+          <w:tcPr>
+            <w:tcW w:type="dxa" w:w="2016"/>
+            <w:shd w:fill="2E74B5"/>
+          </w:tcPr>
+          <w:p>
+            <w:r>
+              <w:rPr>
+                <w:b/>
+                <w:color w:val="FFFFFF"/>
+                <w:sz w:val="14"/>
+              </w:rPr>
+              <w:t>Value</w:t>
+            </w:r>
+          </w:p>
+        </w:tc>
+      </w:tr>
+      <w:tr>
+        <w:tc>
+          <w:tcPr>
+            <w:tcW w:type="dxa" w:w="2016"/>
+          </w:tcPr>
+          <w:p>
+            <w:r>
+              <w:rPr>
+                <w:sz w:val="14"/>
+              </w:rPr>
+              <w:t>Document</w:t>
+            </w:r>
+          </w:p>
+        </w:tc>
+        <w:tc>
+          <w:tcPr>
+            <w:tcW w:type="dxa" w:w="2016"/>
+          </w:tcPr>
+          <w:p>
+            <w:r>
+              <w:rPr>
+                <w:sz w:val="14"/>
+              </w:rPr>
+              <w:t>FlowBoard System Design Document v2.0</w:t>
+            </w:r>
+          </w:p>
+        </w:tc>
+      </w:tr>
+      <w:tr>
+        <w:tc>
+          <w:tcPr>
+            <w:tcW w:type="dxa" w:w="2016"/>
+          </w:tcPr>
+          <w:p>
+            <w:r>
+              <w:rPr>
+                <w:sz w:val="14"/>
+              </w:rPr>
+              <w:t>Product</w:t>
+            </w:r>
+          </w:p>
+        </w:tc>
+        <w:tc>
+          <w:tcPr>
+            <w:tcW w:type="dxa" w:w="2016"/>
+          </w:tcPr>
+          <w:p>
+            <w:r>
+              <w:rPr>
+                <w:sz w:val="14"/>
+              </w:rPr>
+              <w:t>FlowBoard — Multi-Tenant Project Management SaaS (Jira/Linear Clone)</w:t>
+            </w:r>
+          </w:p>
+        </w:tc>
+      </w:tr>
+      <w:tr>
+        <w:tc>
+          <w:tcPr>
+            <w:tcW w:type="dxa" w:w="2016"/>
+          </w:tcPr>
+          <w:p>
+            <w:r>
+              <w:rPr>
+                <w:sz w:val="14"/>
+              </w:rPr>
+              <w:t>Version</w:t>
+            </w:r>
+          </w:p>
+        </w:tc>
+        <w:tc>
+          <w:tcPr>
+            <w:tcW w:type="dxa" w:w="2016"/>
+          </w:tcPr>
+          <w:p>
+            <w:r>
+              <w:rPr>
+                <w:sz w:val="14"/>
+              </w:rPr>
+              <w:t>2.0 (2026-09-14) — Updated after 38/50 tasks, 10 phases</w:t>
+            </w:r>
+          </w:p>
+        </w:tc>
+      </w:tr>
+      <w:tr>
+        <w:tc>
+          <w:tcPr>
+            <w:tcW w:type="dxa" w:w="2016"/>
+          </w:tcPr>
+          <w:p>
+            <w:r>
+              <w:rPr>
+                <w:sz w:val="14"/>
+              </w:rPr>
+              <w:t>Previous</w:t>
+            </w:r>
+          </w:p>
+        </w:tc>
+        <w:tc>
+          <w:tcPr>
+            <w:tcW w:type="dxa" w:w="2016"/>
+          </w:tcPr>
+          <w:p>
+            <w:r>
+              <w:rPr>
+                <w:sz w:val="14"/>
+              </w:rPr>
+              <w:t>v1.3 (2026-09-11) — Added Rate Limiter, ETag, BoardId+StatusId unique</w:t>
+            </w:r>
+          </w:p>
+        </w:tc>
+      </w:tr>
+      <w:tr>
+        <w:tc>
+          <w:tcPr>
+            <w:tcW w:type="dxa" w:w="2016"/>
+          </w:tcPr>
+          <w:p>
+            <w:r>
+              <w:rPr>
+                <w:sz w:val="14"/>
+              </w:rPr>
+              <w:t>Status</w:t>
+            </w:r>
+          </w:p>
+        </w:tc>
+        <w:tc>
+          <w:tcPr>
+            <w:tcW w:type="dxa" w:w="2016"/>
+          </w:tcPr>
+          <w:p>
+            <w:r>
+              <w:rPr>
+                <w:sz w:val="14"/>
+              </w:rPr>
+              <w:t>Approved for Implementation — Code reflects this design</w:t>
+            </w:r>
+          </w:p>
+        </w:tc>
+      </w:tr>
+      <w:tr>
+        <w:tc>
+          <w:tcPr>
+            <w:tcW w:type="dxa" w:w="2016"/>
+          </w:tcPr>
+          <w:p>
+            <w:r>
+              <w:rPr>
+                <w:sz w:val="14"/>
+              </w:rPr>
+              <w:t>Author</w:t>
+            </w:r>
+          </w:p>
+        </w:tc>
+        <w:tc>
+          <w:tcPr>
+            <w:tcW w:type="dxa" w:w="2016"/>
+          </w:tcPr>
+          <w:p>
+            <w:r>
+              <w:rPr>
+                <w:sz w:val="14"/>
+              </w:rPr>
+              <w:t>Prashant Kumar Verma — Full Stack .NET + Angular</w:t>
+            </w:r>
+          </w:p>
+        </w:tc>
+      </w:tr>
+      <w:tr>
+        <w:tc>
+          <w:tcPr>
+            <w:tcW w:type="dxa" w:w="2016"/>
+          </w:tcPr>
+          <w:p>
+            <w:r>
+              <w:rPr>
+                <w:sz w:val="14"/>
+              </w:rPr>
+              <w:t>Intended Audience</w:t>
+            </w:r>
+          </w:p>
+        </w:tc>
+        <w:tc>
+          <w:tcPr>
+            <w:tcW w:type="dxa" w:w="2016"/>
+          </w:tcPr>
+          <w:p>
+            <w:r>
+              <w:rPr>
+                <w:sz w:val="14"/>
+              </w:rPr>
+              <w:t>Senior Architects, Hiring Managers (TCS/Infosys/Accenture), New Developers, AI Sessions</w:t>
+            </w:r>
+          </w:p>
+        </w:tc>
+      </w:tr>
+      <w:tr>
+        <w:tc>
+          <w:tcPr>
+            <w:tcW w:type="dxa" w:w="2016"/>
+          </w:tcPr>
+          <w:p>
+            <w:r>
+              <w:rPr>
+                <w:sz w:val="14"/>
+              </w:rPr>
+              <w:t>Source of Truth</w:t>
+            </w:r>
+          </w:p>
+        </w:tc>
+        <w:tc>
+          <w:tcPr>
+            <w:tcW w:type="dxa" w:w="2016"/>
+          </w:tcPr>
+          <w:p>
+            <w:r>
+              <w:rPr>
+                <w:sz w:val="14"/>
+              </w:rPr>
+              <w:t>This doc + FlowBoard_Tasks_Plan.docx + Documents/TASK_LOG.md — Codebase wins if conflict</w:t>
+            </w:r>
+          </w:p>
+        </w:tc>
+      </w:tr>
+      <w:tr>
+        <w:tc>
+          <w:tcPr>
+            <w:tcW w:type="dxa" w:w="2016"/>
+          </w:tcPr>
+          <w:p>
+            <w:r>
+              <w:rPr>
+                <w:sz w:val="14"/>
+              </w:rPr>
+              <w:t>Reviewers</w:t>
+            </w:r>
+          </w:p>
+        </w:tc>
+        <w:tc>
+          <w:tcPr>
+            <w:tcW w:type="dxa" w:w="2016"/>
+          </w:tcPr>
+          <w:p>
+            <w:r>
+              <w:rPr>
+                <w:sz w:val="14"/>
+              </w:rPr>
+              <w:t>MNC Code Review — Must read before coding any controller/command/service</w:t>
+            </w:r>
+          </w:p>
+        </w:tc>
+      </w:tr>
+    </w:tbl>
+    <w:p>
+      <w:pPr>
+        <w:spacing w:after="80"/>
+      </w:pPr>
+    </w:p>
+    <w:p>
+      <w:pPr>
+        <w:pStyle w:val="Heading1"/>
+        <w:spacing w:before="160" w:after="80"/>
       </w:pPr>
       <w:r>
         <w:rPr>
@@ -92,9 +424,9 @@
         <w:rPr>
           <w:b w:val="0"/>
           <w:i w:val="0"/>
-          <w:sz w:val="16"/>
+          <w:sz w:val="15"/>
         </w:rPr>
-        <w:t>1. Executive Summary &amp; Vision</w:t>
+        <w:t>1. Executive Summary &amp; Vision ................................................... 3</w:t>
       </w:r>
     </w:p>
     <w:p>
@@ -105,9 +437,9 @@
         <w:rPr>
           <w:b w:val="0"/>
           <w:i w:val="0"/>
-          <w:sz w:val="16"/>
+          <w:sz w:val="15"/>
         </w:rPr>
-        <w:t>2. Goals, Non-Goals &amp; Success Metrics</w:t>
+        <w:t>2. Goals, Non-Goals &amp; Success Metrics .......................................... 3</w:t>
       </w:r>
     </w:p>
     <w:p>
@@ -118,9 +450,9 @@
         <w:rPr>
           <w:b w:val="0"/>
           <w:i w:val="0"/>
-          <w:sz w:val="16"/>
+          <w:sz w:val="15"/>
         </w:rPr>
-        <w:t>3. Stakeholders &amp; Personas (6 Roles)</w:t>
+        <w:t>3. Stakeholders &amp; Personas (6→4 Fixed + Custom) ................................ 4</w:t>
       </w:r>
     </w:p>
     <w:p>
@@ -131,9 +463,9 @@
         <w:rPr>
           <w:b w:val="0"/>
           <w:i w:val="0"/>
-          <w:sz w:val="16"/>
+          <w:sz w:val="15"/>
         </w:rPr>
-        <w:t>4. Functional Requirements — 30 User Stories</w:t>
+        <w:t>4. Functional Requirements — 30 User Stories ..................................... 4</w:t>
       </w:r>
     </w:p>
     <w:p>
@@ -144,9 +476,9 @@
         <w:rPr>
           <w:b w:val="0"/>
           <w:i w:val="0"/>
-          <w:sz w:val="16"/>
+          <w:sz w:val="15"/>
         </w:rPr>
-        <w:t>5. Non-Functional Requirements — Performance, Security, Availability</w:t>
+        <w:t>5. Non-Functional Requirements ................................................... 5</w:t>
       </w:r>
     </w:p>
     <w:p>
@@ -157,9 +489,9 @@
         <w:rPr>
           <w:b w:val="0"/>
           <w:i w:val="0"/>
-          <w:sz w:val="16"/>
+          <w:sz w:val="15"/>
         </w:rPr>
-        <w:t>6. Cost Estimation &amp; Capacity Planning (Free Tier $5/month)</w:t>
+        <w:t>6. Cost Estimation &amp; Capacity Planning (Free Tier $5) ............................ 5</w:t>
       </w:r>
     </w:p>
     <w:p>
@@ -170,9 +502,9 @@
         <w:rPr>
           <w:b w:val="0"/>
           <w:i w:val="0"/>
-          <w:sz w:val="16"/>
+          <w:sz w:val="15"/>
         </w:rPr>
-        <w:t>7. Constraints &amp; Assumptions</w:t>
+        <w:t>7. Constraints &amp; Assumptions ..................................................... 6</w:t>
       </w:r>
     </w:p>
     <w:p>
@@ -183,9 +515,9 @@
         <w:rPr>
           <w:b w:val="0"/>
           <w:i w:val="0"/>
-          <w:sz w:val="16"/>
+          <w:sz w:val="15"/>
         </w:rPr>
-        <w:t>8. High-Level Architecture (10 Components + 4 External)</w:t>
+        <w:t>8. High-Level Architecture (10 Components + 4 External) .......................... 6</w:t>
       </w:r>
     </w:p>
     <w:p>
@@ -196,9 +528,9 @@
         <w:rPr>
           <w:b w:val="0"/>
           <w:i w:val="0"/>
-          <w:sz w:val="16"/>
+          <w:sz w:val="15"/>
         </w:rPr>
-        <w:t>9. Technology Stack &amp; Decision Log</w:t>
+        <w:t>9. Technology Stack &amp; Decision Log (10 Decisions) ................................ 7</w:t>
       </w:r>
     </w:p>
     <w:p>
@@ -209,9 +541,9 @@
         <w:rPr>
           <w:b w:val="0"/>
           <w:i w:val="0"/>
-          <w:sz w:val="16"/>
+          <w:sz w:val="15"/>
         </w:rPr>
-        <w:t>10. Component Deep Dive — Gateway.YARP</w:t>
+        <w:t>10. Service Architecture — All 5 Services Deep Dive ............................. 7</w:t>
       </w:r>
     </w:p>
     <w:p>
@@ -222,9 +554,9 @@
         <w:rPr>
           <w:b w:val="0"/>
           <w:i w:val="0"/>
-          <w:sz w:val="16"/>
+          <w:sz w:val="15"/>
         </w:rPr>
-        <w:t>11. Component Deep Dive — Identity.Service (Auth, Orgs, Workspaces, Roles, Permissions, SuperAdmin)</w:t>
+        <w:t>11. Multi-Tenant Architecture (Single DB, 4 Schemas, 15 Tables) ................. 9</w:t>
       </w:r>
     </w:p>
     <w:p>
@@ -235,9 +567,9 @@
         <w:rPr>
           <w:b w:val="0"/>
           <w:i w:val="0"/>
-          <w:sz w:val="16"/>
+          <w:sz w:val="15"/>
         </w:rPr>
-        <w:t>12. Component Deep Dive — Project.Service (Project, Board, Status, Issue, Sprint, Team, Member, Activity, AI)</w:t>
+        <w:t>12. Authentication, Authorization &amp; Permissions (Fixed 0-3 + Custom + SuperAdmin) 10</w:t>
       </w:r>
     </w:p>
     <w:p>
@@ -248,9 +580,9 @@
         <w:rPr>
           <w:b w:val="0"/>
           <w:i w:val="0"/>
-          <w:sz w:val="16"/>
+          <w:sz w:val="15"/>
         </w:rPr>
-        <w:t>13. Component Deep Dive — File.Service (Cloudinary)</w:t>
+        <w:t>13. Domain / Project Management Model (Org→Ws→Project→Board/Issue/Sprint/Team) .. 10</w:t>
       </w:r>
     </w:p>
     <w:p>
@@ -261,9 +593,9 @@
         <w:rPr>
           <w:b w:val="0"/>
           <w:i w:val="0"/>
-          <w:sz w:val="16"/>
+          <w:sz w:val="15"/>
         </w:rPr>
-        <w:t>14. Component Deep Dive — Notification.Service (MassTransit, SignalR)</w:t>
+        <w:t>14. Board Status Mapping (1 Column = N Statuses, 1 Status = 1 Column per Board) .. 11</w:t>
       </w:r>
     </w:p>
     <w:p>
@@ -274,9 +606,9 @@
         <w:rPr>
           <w:b w:val="0"/>
           <w:i w:val="0"/>
-          <w:sz w:val="16"/>
+          <w:sz w:val="15"/>
         </w:rPr>
-        <w:t>15. Component Deep Dive — Frontend (Angular 22, Signals, TanStack, 3-File Rule)</w:t>
+        <w:t>15. Database Architecture (EF Core 10, Migrations, Indexes) ...................... 11</w:t>
       </w:r>
     </w:p>
     <w:p>
@@ -287,9 +619,9 @@
         <w:rPr>
           <w:b w:val="0"/>
           <w:i w:val="0"/>
-          <w:sz w:val="16"/>
+          <w:sz w:val="15"/>
         </w:rPr>
-        <w:t>16. Data Model &amp; Multi-Tenancy (Single DB flowboard, 4 Schemas, 15+ Tables)</w:t>
+        <w:t>16. API &amp; Communication Architecture (YARP Order 0/1, ETag, Clamp) ............... 12</w:t>
       </w:r>
     </w:p>
     <w:p>
@@ -300,9 +632,9 @@
         <w:rPr>
           <w:b w:val="0"/>
           <w:i w:val="0"/>
-          <w:sz w:val="16"/>
+          <w:sz w:val="15"/>
         </w:rPr>
-        <w:t>17. Board Status Mapping — 1 Column = N Statuses, 1 Status = 1 Column per Board, ≥1 Required, 1→0 Guard</w:t>
+        <w:t>17. Redis Caching — 3 Layers (TanStack 2m → Redis 5m/2m → SQL + ETag) ............ 12</w:t>
       </w:r>
     </w:p>
     <w:p>
@@ -313,9 +645,9 @@
         <w:rPr>
           <w:b w:val="0"/>
           <w:i w:val="0"/>
-          <w:sz w:val="16"/>
+          <w:sz w:val="15"/>
         </w:rPr>
-        <w:t>18. Authentication, Authorization &amp; Permissions (Fixed 0-3 + Custom + SuperAdmin, 32 Keys, my-permissions in me)</w:t>
+        <w:t>18. RabbitMQ &amp; Asynchronous Processing (Outbox 2s, Fanout) ....................... 13</w:t>
       </w:r>
     </w:p>
     <w:p>
@@ -326,9 +658,9 @@
         <w:rPr>
           <w:b w:val="0"/>
           <w:i w:val="0"/>
-          <w:sz w:val="16"/>
+          <w:sz w:val="15"/>
         </w:rPr>
-        <w:t>19. Caching Strategy — 3 Layers (TanStack 2m → Redis 5m/2m → SQL + ETag 304 + no-cache)</w:t>
+        <w:t>19. Real-Time with SignalR (Hub Groups, Upstash Backplane) ...................... 13</w:t>
       </w:r>
     </w:p>
     <w:p>
@@ -339,9 +671,9 @@
         <w:rPr>
           <w:b w:val="0"/>
           <w:i w:val="0"/>
-          <w:sz w:val="16"/>
+          <w:sz w:val="15"/>
         </w:rPr>
-        <w:t>20. Asynchronous Processing — Outbox 2s + RabbitMQ Fanout + SignalR Groups</w:t>
+        <w:t>20. AI-Assisted Development (Gemini/Groq, 4 Ops, Hash/Preview, Usage) ........... 14</w:t>
       </w:r>
     </w:p>
     <w:p>
@@ -352,9 +684,9 @@
         <w:rPr>
           <w:b w:val="0"/>
           <w:i w:val="0"/>
-          <w:sz w:val="16"/>
+          <w:sz w:val="15"/>
         </w:rPr>
-        <w:t>21. Rate Limiting — Sliding Window Counter, Redis Lua Atomic (200 IP / 300 User)</w:t>
+        <w:t>21. File Management (Cloudinary 25MB, RawUpload) ................................ 14</w:t>
       </w:r>
     </w:p>
     <w:p>
@@ -365,9 +697,9 @@
         <w:rPr>
           <w:b w:val="0"/>
           <w:i w:val="0"/>
-          <w:sz w:val="16"/>
+          <w:sz w:val="15"/>
         </w:rPr>
-        <w:t>22. AI Intelligence — Gemini + Groq, 4 Operations, Provider Abstraction, Hash/Preview, Usage</w:t>
+        <w:t>22. Notification Architecture (MassTransit Consumers, Retry, DLQ) ................ 15</w:t>
       </w:r>
     </w:p>
     <w:p>
@@ -378,9 +710,9 @@
         <w:rPr>
           <w:b w:val="0"/>
           <w:i w:val="0"/>
-          <w:sz w:val="16"/>
+          <w:sz w:val="15"/>
         </w:rPr>
-        <w:t>23. File &amp; Attachment Flow — Cloudinary RawUploadParams, 25MB, Outbox</w:t>
+        <w:t>23. Rate Limiting — Sliding Window Counter, Redis Lua Atomic .................... 15</w:t>
       </w:r>
     </w:p>
     <w:p>
@@ -391,9 +723,9 @@
         <w:rPr>
           <w:b w:val="0"/>
           <w:i w:val="0"/>
-          <w:sz w:val="16"/>
+          <w:sz w:val="15"/>
         </w:rPr>
-        <w:t>24. SuperAdmin Platform — 10 Portals, Least Privilege, 503 Maintenance</w:t>
+        <w:t>24. Logging, Correlation &amp; Observability (Serilog JSON + Correlation N) ......... 16</w:t>
       </w:r>
     </w:p>
     <w:p>
@@ -404,9 +736,9 @@
         <w:rPr>
           <w:b w:val="0"/>
           <w:i w:val="0"/>
-          <w:sz w:val="16"/>
+          <w:sz w:val="15"/>
         </w:rPr>
-        <w:t>25. Frontend Performance — 26 Chunks, OnPush, Lazy ApexCharts, Debounce, a11y</w:t>
+        <w:t>25. SuperAdmin Platform (10 Portals, Least Privilege, 503) ...................... 16</w:t>
       </w:r>
     </w:p>
     <w:p>
@@ -417,9 +749,9 @@
         <w:rPr>
           <w:b w:val="0"/>
           <w:i w:val="0"/>
-          <w:sz w:val="16"/>
+          <w:sz w:val="15"/>
         </w:rPr>
-        <w:t>26. API Design — YARP Order 0/1, ETag, Pagination Clamp, Human Error UX</w:t>
+        <w:t>26. Platform Settings (9 Sections, 5 Writable) .................................. 17</w:t>
       </w:r>
     </w:p>
     <w:p>
@@ -430,9 +762,9 @@
         <w:rPr>
           <w:b w:val="0"/>
           <w:i w:val="0"/>
-          <w:sz w:val="16"/>
+          <w:sz w:val="15"/>
         </w:rPr>
-        <w:t>27. Observability — Serilog JSON 30d + CorrelationId N + Health Scalar</w:t>
+        <w:t>27. Frontend Architecture (Angular 22, 26 Chunks, OnPush, 3-File) ................ 17</w:t>
       </w:r>
     </w:p>
     <w:p>
@@ -443,9 +775,9 @@
         <w:rPr>
           <w:b w:val="0"/>
           <w:i w:val="0"/>
-          <w:sz w:val="16"/>
+          <w:sz w:val="15"/>
         </w:rPr>
-        <w:t>28. Security Model — JWT, Refresh, Brevo, Cloudinary Signed, Brevo, Gemini Keys</w:t>
+        <w:t>28. Deployment Architecture (Vercel + MonsterASP.net, Same Keys) ................. 18</w:t>
       </w:r>
     </w:p>
     <w:p>
@@ -456,9 +788,9 @@
         <w:rPr>
           <w:b w:val="0"/>
           <w:i w:val="0"/>
-          <w:sz w:val="16"/>
+          <w:sz w:val="15"/>
         </w:rPr>
-        <w:t>29. Deployment Architecture — Vercel + MonsterASP.net, Same Keys Local/Prod</w:t>
+        <w:t>29. Security Architecture (JWT, Refresh, Brevo, Cloudinary Signed) ............... 18</w:t>
       </w:r>
     </w:p>
     <w:p>
@@ -469,9 +801,9 @@
         <w:rPr>
           <w:b w:val="0"/>
           <w:i w:val="0"/>
-          <w:sz w:val="16"/>
+          <w:sz w:val="15"/>
         </w:rPr>
-        <w:t>30. Testing Strategy — xUnit 70% Separate backend/tests, Integration, No Frontend per Request</w:t>
+        <w:t>30. Reliability &amp; Failure Handling (Outbox, Retry, DLQ, 503, 429) ................ 19</w:t>
       </w:r>
     </w:p>
     <w:p>
@@ -482,9 +814,9 @@
         <w:rPr>
           <w:b w:val="0"/>
           <w:i w:val="0"/>
-          <w:sz w:val="16"/>
+          <w:sz w:val="15"/>
         </w:rPr>
-        <w:t>31. Challenges &amp; Trade-offs (10 Decisions)</w:t>
+        <w:t>31. Performance Considerations (26 Chunks, Lazy ApexCharts, Debounce) ............ 19</w:t>
       </w:r>
     </w:p>
     <w:p>
@@ -495,9 +827,9 @@
         <w:rPr>
           <w:b w:val="0"/>
           <w:i w:val="0"/>
-          <w:sz w:val="16"/>
+          <w:sz w:val="15"/>
         </w:rPr>
-        <w:t>32. Future Improvements (10 Honest)</w:t>
+        <w:t>32. Architectural Decisions &amp; Trade-offs (10) .................................... 20</w:t>
       </w:r>
     </w:p>
     <w:p>
@@ -508,9 +840,9 @@
         <w:rPr>
           <w:b w:val="0"/>
           <w:i w:val="0"/>
-          <w:sz w:val="16"/>
+          <w:sz w:val="15"/>
         </w:rPr>
-        <w:t>33. Glossary &amp; References</w:t>
+        <w:t>33. Current Limitations (Not Invented) .......................................... 20</w:t>
       </w:r>
     </w:p>
     <w:p>
@@ -521,15 +853,54 @@
         <w:rPr>
           <w:b w:val="0"/>
           <w:i w:val="0"/>
-          <w:sz w:val="16"/>
+          <w:sz w:val="15"/>
         </w:rPr>
-        <w:t>34. Appendix — Event Catalog, API Endpoints, Config</w:t>
+        <w:t>34. Future Improvements (Honest, Not Claimed) ................................... 20</w:t>
       </w:r>
     </w:p>
     <w:p>
       <w:pPr>
+        <w:spacing w:after="60"/>
+      </w:pPr>
+      <w:r>
+        <w:rPr>
+          <w:b w:val="0"/>
+          <w:i w:val="0"/>
+          <w:sz w:val="15"/>
+        </w:rPr>
+        <w:t>35. Conclusion .................................................................. 21</w:t>
+      </w:r>
+    </w:p>
+    <w:p>
+      <w:pPr>
+        <w:spacing w:after="60"/>
+      </w:pPr>
+      <w:r>
+        <w:rPr>
+          <w:b w:val="0"/>
+          <w:i w:val="0"/>
+          <w:sz w:val="15"/>
+        </w:rPr>
+        <w:t>36. Glossary &amp; References ....................................................... 21</w:t>
+      </w:r>
+    </w:p>
+    <w:p>
+      <w:pPr>
+        <w:spacing w:after="60"/>
+      </w:pPr>
+      <w:r>
+        <w:rPr>
+          <w:b w:val="0"/>
+          <w:i w:val="0"/>
+          <w:sz w:val="15"/>
+        </w:rPr>
+        <w:t>Appendix A — Event Catalog, B — Config, C — API Endpoints, D — Troubleshooting .. 22</w:t>
+      </w:r>
+    </w:p>
+    <w:p>
+      <w:pPr>
         <w:pStyle w:val="Heading1"/>
-        <w:spacing w:before="120" w:after="60"/>
+        <w:spacing w:before="160" w:after="80"/>
       </w:pPr>
       <w:r>
         <w:rPr>
@@ -548,15 +919,318 @@
         <w:rPr>
           <w:b w:val="0"/>
           <w:i w:val="0"/>
-          <w:sz w:val="16"/>
+          <w:sz w:val="17"/>
         </w:rPr>
-        <w:t>FlowBoard proves SaaS thinking, not just CRUD. It is a Jira/Linear clone for organizations to manage workspaces, projects, boards, sprints, issues, teams, members, files, and AI-assisted workflows, with a dedicated SuperAdmin platform for platform ops. Built as Angular 22 Standalone (Signals + TanStack Query) + .NET 10 microservices (YARP Gateway + 4 services) on a single SQL Server flowboard DB with 4 schemas, Upstash Redis, CloudAMQP RabbitMQ, Cloudinary, Brevo, and Gemini/Groq. All features were planned first in this System Design and in FlowBoard_Tasks_Plan.docx, then executed one task at a time with Documents/TASK_LOG.md as the living diary (38/50 completed, remaining 5.2 Tests, 5.3 Docs, 5.4 Deploy, 3.1-3.3 Realtime).</w:t>
+        <w:t>FlowBoard proves SaaS thinking, not just CRUD. It is a Jira/Linear clone for organizations to manage workspaces, projects, boards, sprints, issues, teams, members, files, and AI-assisted workflows, with a dedicated SuperAdmin platform for platform ops. Built as Angular 22 Standalone (Signals + TanStack Query) + .NET 10 microservices (YARP Gateway + 4 services) on a single SQL Server flowboard DB with 4 schemas, Upstash Redis, CloudAMQP RabbitMQ, Cloudinary, Brevo, and Gemini/Groq. All features were planned first in this System Design and in FlowBoard_Tasks_Plan.docx, then executed one task at a time with Documents/TASK_LOG.md as the living diary (38/50 completed, remaining 5.2 Tests, 5.3 Docs, 5.4 Deploy, 3.1-3.3 Realtime). The vision is a flagship portfolio project that demonstrates how a real SaaS operates — Board Status mapping, Outbox, Sliding Window Lua, ETag — not just screens.</w:t>
       </w:r>
     </w:p>
+    <w:tbl>
+      <w:tblPr>
+        <w:tblStyle w:val="LightGrid-Accent1"/>
+        <w:tblW w:type="auto" w:w="0"/>
+        <w:tblLayout w:type="fixed"/>
+        <w:tblLook w:firstColumn="1" w:firstRow="1" w:lastColumn="0" w:lastRow="0" w:noHBand="0" w:noVBand="1" w:val="04A0"/>
+      </w:tblPr>
+      <w:tblGrid>
+        <w:gridCol w:w="5400"/>
+        <w:gridCol w:w="5400"/>
+      </w:tblGrid>
+      <w:tr>
+        <w:tc>
+          <w:tcPr>
+            <w:tcW w:type="dxa" w:w="2016"/>
+            <w:shd w:fill="2E74B5"/>
+          </w:tcPr>
+          <w:p>
+            <w:r>
+              <w:rPr>
+                <w:b/>
+                <w:color w:val="FFFFFF"/>
+                <w:sz w:val="14"/>
+              </w:rPr>
+              <w:t>Metric</w:t>
+            </w:r>
+          </w:p>
+        </w:tc>
+        <w:tc>
+          <w:tcPr>
+            <w:tcW w:type="dxa" w:w="2016"/>
+            <w:shd w:fill="2E74B5"/>
+          </w:tcPr>
+          <w:p>
+            <w:r>
+              <w:rPr>
+                <w:b/>
+                <w:color w:val="FFFFFF"/>
+                <w:sz w:val="14"/>
+              </w:rPr>
+              <w:t>Value</w:t>
+            </w:r>
+          </w:p>
+        </w:tc>
+      </w:tr>
+      <w:tr>
+        <w:tc>
+          <w:tcPr>
+            <w:tcW w:type="dxa" w:w="2016"/>
+          </w:tcPr>
+          <w:p>
+            <w:r>
+              <w:rPr>
+                <w:sz w:val="14"/>
+              </w:rPr>
+              <w:t>Product</w:t>
+            </w:r>
+          </w:p>
+        </w:tc>
+        <w:tc>
+          <w:tcPr>
+            <w:tcW w:type="dxa" w:w="2016"/>
+          </w:tcPr>
+          <w:p>
+            <w:r>
+              <w:rPr>
+                <w:sz w:val="14"/>
+              </w:rPr>
+              <w:t>FlowBoard — Jira/Linear Clone — Multi-Tenant SaaS</w:t>
+            </w:r>
+          </w:p>
+        </w:tc>
+      </w:tr>
+      <w:tr>
+        <w:tc>
+          <w:tcPr>
+            <w:tcW w:type="dxa" w:w="2016"/>
+          </w:tcPr>
+          <w:p>
+            <w:r>
+              <w:rPr>
+                <w:sz w:val="14"/>
+              </w:rPr>
+              <w:t>Frontend</w:t>
+            </w:r>
+          </w:p>
+        </w:tc>
+        <w:tc>
+          <w:tcPr>
+            <w:tcW w:type="dxa" w:w="2016"/>
+          </w:tcPr>
+          <w:p>
+            <w:r>
+              <w:rPr>
+                <w:sz w:val="14"/>
+              </w:rPr>
+              <w:t>Angular 22.1.5 Standalone + TS 6.0.3 + Tailwind + DaisyUI 4.12.14 + TanStack 5.62</w:t>
+            </w:r>
+          </w:p>
+        </w:tc>
+      </w:tr>
+      <w:tr>
+        <w:tc>
+          <w:tcPr>
+            <w:tcW w:type="dxa" w:w="2016"/>
+          </w:tcPr>
+          <w:p>
+            <w:r>
+              <w:rPr>
+                <w:sz w:val="14"/>
+              </w:rPr>
+              <w:t>Backend</w:t>
+            </w:r>
+          </w:p>
+        </w:tc>
+        <w:tc>
+          <w:tcPr>
+            <w:tcW w:type="dxa" w:w="2016"/>
+          </w:tcPr>
+          <w:p>
+            <w:r>
+              <w:rPr>
+                <w:sz w:val="14"/>
+              </w:rPr>
+              <w:t>.NET 10 + YARP 2.3 + EF Core 10 + MediatR 12.4 + MassTransit 8.3</w:t>
+            </w:r>
+          </w:p>
+        </w:tc>
+      </w:tr>
+      <w:tr>
+        <w:tc>
+          <w:tcPr>
+            <w:tcW w:type="dxa" w:w="2016"/>
+          </w:tcPr>
+          <w:p>
+            <w:r>
+              <w:rPr>
+                <w:sz w:val="14"/>
+              </w:rPr>
+              <w:t>Database</w:t>
+            </w:r>
+          </w:p>
+        </w:tc>
+        <w:tc>
+          <w:tcPr>
+            <w:tcW w:type="dxa" w:w="2016"/>
+          </w:tcPr>
+          <w:p>
+            <w:r>
+              <w:rPr>
+                <w:sz w:val="14"/>
+              </w:rPr>
+              <w:t>SQL Server flowboard 4 schemas (identity, project, file, notification)</w:t>
+            </w:r>
+          </w:p>
+        </w:tc>
+      </w:tr>
+      <w:tr>
+        <w:tc>
+          <w:tcPr>
+            <w:tcW w:type="dxa" w:w="2016"/>
+          </w:tcPr>
+          <w:p>
+            <w:r>
+              <w:rPr>
+                <w:sz w:val="14"/>
+              </w:rPr>
+              <w:t>Cache</w:t>
+            </w:r>
+          </w:p>
+        </w:tc>
+        <w:tc>
+          <w:tcPr>
+            <w:tcW w:type="dxa" w:w="2016"/>
+          </w:tcPr>
+          <w:p>
+            <w:r>
+              <w:rPr>
+                <w:sz w:val="14"/>
+              </w:rPr>
+              <w:t>Upstash Redis rediss:// board 5m tasks 2m</w:t>
+            </w:r>
+          </w:p>
+        </w:tc>
+      </w:tr>
+      <w:tr>
+        <w:tc>
+          <w:tcPr>
+            <w:tcW w:type="dxa" w:w="2016"/>
+          </w:tcPr>
+          <w:p>
+            <w:r>
+              <w:rPr>
+                <w:sz w:val="14"/>
+              </w:rPr>
+              <w:t>Queue</w:t>
+            </w:r>
+          </w:p>
+        </w:tc>
+        <w:tc>
+          <w:tcPr>
+            <w:tcW w:type="dxa" w:w="2016"/>
+          </w:tcPr>
+          <w:p>
+            <w:r>
+              <w:rPr>
+                <w:sz w:val="14"/>
+              </w:rPr>
+              <w:t>CloudAMQP RabbitMQ amqps:// fanout flowboard.events</w:t>
+            </w:r>
+          </w:p>
+        </w:tc>
+      </w:tr>
+      <w:tr>
+        <w:tc>
+          <w:tcPr>
+            <w:tcW w:type="dxa" w:w="2016"/>
+          </w:tcPr>
+          <w:p>
+            <w:r>
+              <w:rPr>
+                <w:sz w:val="14"/>
+              </w:rPr>
+              <w:t>Realtime</w:t>
+            </w:r>
+          </w:p>
+        </w:tc>
+        <w:tc>
+          <w:tcPr>
+            <w:tcW w:type="dxa" w:w="2016"/>
+          </w:tcPr>
+          <w:p>
+            <w:r>
+              <w:rPr>
+                <w:sz w:val="14"/>
+              </w:rPr>
+              <w:t>SignalR 10.0 Hub :5004 /hubs/board Groups</w:t>
+            </w:r>
+          </w:p>
+        </w:tc>
+      </w:tr>
+      <w:tr>
+        <w:tc>
+          <w:tcPr>
+            <w:tcW w:type="dxa" w:w="2016"/>
+          </w:tcPr>
+          <w:p>
+            <w:r>
+              <w:rPr>
+                <w:sz w:val="14"/>
+              </w:rPr>
+              <w:t>AI</w:t>
+            </w:r>
+          </w:p>
+        </w:tc>
+        <w:tc>
+          <w:tcPr>
+            <w:tcW w:type="dxa" w:w="2016"/>
+          </w:tcPr>
+          <w:p>
+            <w:r>
+              <w:rPr>
+                <w:sz w:val="14"/>
+              </w:rPr>
+              <w:t>Gemini 2.5 Flash + Groq llama-3.1-8b</w:t>
+            </w:r>
+          </w:p>
+        </w:tc>
+      </w:tr>
+      <w:tr>
+        <w:tc>
+          <w:tcPr>
+            <w:tcW w:type="dxa" w:w="2016"/>
+          </w:tcPr>
+          <w:p>
+            <w:r>
+              <w:rPr>
+                <w:sz w:val="14"/>
+              </w:rPr>
+              <w:t>Deploy</w:t>
+            </w:r>
+          </w:p>
+        </w:tc>
+        <w:tc>
+          <w:tcPr>
+            <w:tcW w:type="dxa" w:w="2016"/>
+          </w:tcPr>
+          <w:p>
+            <w:r>
+              <w:rPr>
+                <w:sz w:val="14"/>
+              </w:rPr>
+              <w:t>Vercel (frontend) + MonsterASP.net (4 services) — Same keys local/prod</w:t>
+            </w:r>
+          </w:p>
+        </w:tc>
+      </w:tr>
+    </w:tbl>
     <w:p>
       <w:pPr>
+        <w:spacing w:after="80"/>
+      </w:pPr>
+    </w:p>
+    <w:p>
+      <w:pPr>
         <w:pStyle w:val="Heading1"/>
-        <w:spacing w:before="120" w:after="60"/>
+        <w:spacing w:before="160" w:after="80"/>
       </w:pPr>
       <w:r>
         <w:rPr>
@@ -575,15 +1249,15 @@
         <w:rPr>
           <w:b w:val="0"/>
           <w:i w:val="0"/>
-          <w:sz w:val="16"/>
+          <w:sz w:val="17"/>
         </w:rPr>
-        <w:t>Goals: Multi-tenant SaaS with org → workspace → project isolation, 4 fixed roles + dynamic custom OrganizationWorkspaceRoles per org via RolePermissions (32 keys), Project → Boards as views over Issues (Status per project, BoardColumnStatus per board BoardId+StatusId unique, ≥1, 1→0 guard), Sprints per Board, Teams per Project, Backlog ListId null, Files via Cloudinary 25MB, Notifications via RabbitMQ + SignalR, AI via Gemini/Groq with provider abstraction, SuperAdmin 10 portals least privilege, MNC production-grade: Clean Architecture, YARP Order, Redis pipeline, Outbox, Lua, Serilog Correlation, ETag, Human Error. Non-Goals: Advanced workflow engine, Google OAuth, Email verification, Vector search. Success: Board HIT 200ms, 70% tests, Lighthouse 95+, 0 hardcoded custom roles.</w:t>
+        <w:t>Goals: Multi-tenant SaaS with org → workspace → project isolation, single DB 4 schemas cost-effective on MonsterASP.net; 4 fixed roles + dynamic custom OrganizationWorkspaceRoles per org via RolePermissions (32 keys); Project → Boards as views over Issues (Status per project, BoardColumnStatus per board BoardId+StatusId unique, ≥1, 1→0 guard); Sprints per Board, Teams per Project, Backlog ListId null; Files via Cloudinary 25MB; Notifications via RabbitMQ + SignalR; AI via Gemini/Groq; SuperAdmin 10 portals least privilege. Non-Goals: Advanced workflow engine, Google OAuth, Email verification, Vector search. Success: Board HIT 200ms, 70% tests separate, Lighthouse 95+, 0 hardcoded custom roles.</w:t>
       </w:r>
     </w:p>
     <w:p>
       <w:pPr>
         <w:pStyle w:val="Heading1"/>
-        <w:spacing w:before="120" w:after="60"/>
+        <w:spacing w:before="160" w:after="80"/>
       </w:pPr>
       <w:r>
         <w:rPr>
@@ -591,7 +1265,7 @@
           <w:color w:val="2E74B5"/>
           <w:sz w:val="28"/>
         </w:rPr>
-        <w:t>3. Stakeholders &amp; Personas (6→4 Fixed + Custom)</w:t>
+        <w:t>3. Stakeholders &amp; Personas</w:t>
       </w:r>
     </w:p>
     <w:p>
@@ -602,15 +1276,15 @@
         <w:rPr>
           <w:b w:val="0"/>
           <w:i w:val="0"/>
-          <w:sz w:val="16"/>
+          <w:sz w:val="17"/>
         </w:rPr>
-        <w:t>SuperAdmin global (Users.IsSuperAdmin, not OrganizationMember) — platform owner, sees aggregate. OrgAdmin (2) — org owner or OrganizationMember Role 2, complete authority over any task in org, can create project/board/status. Member (1) — org ∩ workspace ∩ project member, can view/comment/move own, upload. Client (3) — external, view assigned + comment/attach, 403 POST /tasks. Custom — per org via OrganizationWorkspaceRoles (Developer, QA), permissions via RolePermissions, checked via HasCustomPermissionAsync. Legacy ProjectManager/Viewer → Member fallback removed.</w:t>
+        <w:t>SuperAdmin global (Users.IsSuperAdmin, not OrganizationMember) — platform owner, sees aggregate. OrgAdmin (2) — org Owner or OrganizationMember Role 2, complete authority over any task in org. Member (1) — org ∩ workspace ∩ project member. Client (3) — external, view assigned + comment/attach, 403 POST /tasks. Custom — per org via OrganizationWorkspaceRoles (Developer, QA), permissions via RolePermissions, checked via HasCustomPermissionAsync. Legacy ProjectManager/Viewer → Member fallback removed.</w:t>
       </w:r>
     </w:p>
     <w:p>
       <w:pPr>
         <w:pStyle w:val="Heading1"/>
-        <w:spacing w:before="120" w:after="60"/>
+        <w:spacing w:before="160" w:after="80"/>
       </w:pPr>
       <w:r>
         <w:rPr>
@@ -629,9 +1303,9 @@
         <w:rPr>
           <w:b w:val="0"/>
           <w:i w:val="0"/>
-          <w:sz w:val="16"/>
+          <w:sz w:val="17"/>
         </w:rPr>
-        <w:t>F-01 OrgAdmin Create organization/workspace. F-02 Invite Member/Client + create custom role Developer. F-03 Create project (OrgAdmin/SuperAdmin or custom project:create, Member 403). F-04 Create board/column with status mapping ≥1, per-board unique, 1→0 guard. F-05 Create issue/task (Member+). F-06 Move task drag-drop with Redis lock. F-07 Client comment. F-08 Upload attachment 25MB whitelist. F-09 Manage statuses/sprints/teams. F-10 AI Draft/Enhance/Criteria/Breakdown. F-11 SuperAdmin 10 portals. Each maps to API + E2E Postman (now removed per request, but tested via Integration tests).</w:t>
+        <w:t>F-01 OrgAdmin Create org/workspace. F-02 Invite Member/Client + custom role Developer. F-03 Create project (OrgAdmin/SuperAdmin or custom project:create, Member 403). F-04 Create board/column with status mapping ≥1, per-board unique, 1→0 guard. F-05 Create issue/task. F-06 Move task drag-drop with Redis lock. F-07 Client comment. F-08 Upload attachment. F-09 Manage statuses/sprints/teams. F-10 AI Draft/Enhance/Criteria/Breakdown. F-11 SuperAdmin 10 portals. Each maps to API + E2E Postman (removed per request, but tested via Integration tests).</w:t>
       </w:r>
     </w:p>
     <w:tbl>
@@ -650,7 +1324,7 @@
       <w:tr>
         <w:tc>
           <w:tcPr>
-            <w:tcW w:type="dxa" w:w="2700"/>
+            <w:tcW w:type="dxa" w:w="2016"/>
             <w:shd w:fill="2E74B5"/>
           </w:tcPr>
           <w:p>
@@ -666,7 +1340,7 @@
         </w:tc>
         <w:tc>
           <w:tcPr>
-            <w:tcW w:type="dxa" w:w="2700"/>
+            <w:tcW w:type="dxa" w:w="2016"/>
             <w:shd w:fill="2E74B5"/>
           </w:tcPr>
           <w:p>
@@ -682,7 +1356,7 @@
         </w:tc>
         <w:tc>
           <w:tcPr>
-            <w:tcW w:type="dxa" w:w="2700"/>
+            <w:tcW w:type="dxa" w:w="2016"/>
             <w:shd w:fill="2E74B5"/>
           </w:tcPr>
           <w:p>
@@ -698,7 +1372,7 @@
         </w:tc>
         <w:tc>
           <w:tcPr>
-            <w:tcW w:type="dxa" w:w="2700"/>
+            <w:tcW w:type="dxa" w:w="2016"/>
             <w:shd w:fill="2E74B5"/>
           </w:tcPr>
           <w:p>
@@ -716,7 +1390,7 @@
       <w:tr>
         <w:tc>
           <w:tcPr>
-            <w:tcW w:type="dxa" w:w="2700"/>
+            <w:tcW w:type="dxa" w:w="2016"/>
           </w:tcPr>
           <w:p>
             <w:r>
@@ -729,7 +1403,7 @@
         </w:tc>
         <w:tc>
           <w:tcPr>
-            <w:tcW w:type="dxa" w:w="2700"/>
+            <w:tcW w:type="dxa" w:w="2016"/>
           </w:tcPr>
           <w:p>
             <w:r>
@@ -742,7 +1416,7 @@
         </w:tc>
         <w:tc>
           <w:tcPr>
-            <w:tcW w:type="dxa" w:w="2700"/>
+            <w:tcW w:type="dxa" w:w="2016"/>
           </w:tcPr>
           <w:p>
             <w:r>
@@ -755,7 +1429,7 @@
         </w:tc>
         <w:tc>
           <w:tcPr>
-            <w:tcW w:type="dxa" w:w="2700"/>
+            <w:tcW w:type="dxa" w:w="2016"/>
           </w:tcPr>
           <w:p>
             <w:r>
@@ -770,20 +1444,20 @@
       <w:tr>
         <w:tc>
           <w:tcPr>
-            <w:tcW w:type="dxa" w:w="2700"/>
+            <w:tcW w:type="dxa" w:w="2016"/>
           </w:tcPr>
           <w:p>
             <w:r>
               <w:rPr>
                 <w:sz w:val="14"/>
               </w:rPr>
-              <w:t>F-02</w:t>
+              <w:t>F-03</w:t>
             </w:r>
           </w:p>
         </w:tc>
         <w:tc>
           <w:tcPr>
-            <w:tcW w:type="dxa" w:w="2700"/>
+            <w:tcW w:type="dxa" w:w="2016"/>
           </w:tcPr>
           <w:p>
             <w:r>
@@ -796,61 +1470,7 @@
         </w:tc>
         <w:tc>
           <w:tcPr>
-            <w:tcW w:type="dxa" w:w="2700"/>
-          </w:tcPr>
-          <w:p>
-            <w:r>
-              <w:rPr>
-                <w:sz w:val="14"/>
-              </w:rPr>
-              <w:t>Invite + custom role</w:t>
-            </w:r>
-          </w:p>
-        </w:tc>
-        <w:tc>
-          <w:tcPr>
-            <w:tcW w:type="dxa" w:w="2700"/>
-          </w:tcPr>
-          <w:p>
-            <w:r>
-              <w:rPr>
-                <w:sz w:val="14"/>
-              </w:rPr>
-              <w:t>Member sees workspace</w:t>
-            </w:r>
-          </w:p>
-        </w:tc>
-      </w:tr>
-      <w:tr>
-        <w:tc>
-          <w:tcPr>
-            <w:tcW w:type="dxa" w:w="2700"/>
-          </w:tcPr>
-          <w:p>
-            <w:r>
-              <w:rPr>
-                <w:sz w:val="14"/>
-              </w:rPr>
-              <w:t>F-03</w:t>
-            </w:r>
-          </w:p>
-        </w:tc>
-        <w:tc>
-          <w:tcPr>
-            <w:tcW w:type="dxa" w:w="2700"/>
-          </w:tcPr>
-          <w:p>
-            <w:r>
-              <w:rPr>
-                <w:sz w:val="14"/>
-              </w:rPr>
-              <w:t>OrgAdmin</w:t>
-            </w:r>
-          </w:p>
-        </w:tc>
-        <w:tc>
-          <w:tcPr>
-            <w:tcW w:type="dxa" w:w="2700"/>
+            <w:tcW w:type="dxa" w:w="2016"/>
           </w:tcPr>
           <w:p>
             <w:r>
@@ -863,7 +1483,7 @@
         </w:tc>
         <w:tc>
           <w:tcPr>
-            <w:tcW w:type="dxa" w:w="2700"/>
+            <w:tcW w:type="dxa" w:w="2016"/>
           </w:tcPr>
           <w:p>
             <w:r>
@@ -878,7 +1498,7 @@
       <w:tr>
         <w:tc>
           <w:tcPr>
-            <w:tcW w:type="dxa" w:w="2700"/>
+            <w:tcW w:type="dxa" w:w="2016"/>
           </w:tcPr>
           <w:p>
             <w:r>
@@ -891,7 +1511,7 @@
         </w:tc>
         <w:tc>
           <w:tcPr>
-            <w:tcW w:type="dxa" w:w="2700"/>
+            <w:tcW w:type="dxa" w:w="2016"/>
           </w:tcPr>
           <w:p>
             <w:r>
@@ -904,7 +1524,7 @@
         </w:tc>
         <w:tc>
           <w:tcPr>
-            <w:tcW w:type="dxa" w:w="2700"/>
+            <w:tcW w:type="dxa" w:w="2016"/>
           </w:tcPr>
           <w:p>
             <w:r>
@@ -917,7 +1537,7 @@
         </w:tc>
         <w:tc>
           <w:tcPr>
-            <w:tcW w:type="dxa" w:w="2700"/>
+            <w:tcW w:type="dxa" w:w="2016"/>
           </w:tcPr>
           <w:p>
             <w:r>
@@ -938,7 +1558,7 @@
     <w:p>
       <w:pPr>
         <w:pStyle w:val="Heading1"/>
-        <w:spacing w:before="120" w:after="60"/>
+        <w:spacing w:before="160" w:after="80"/>
       </w:pPr>
       <w:r>
         <w:rPr>
@@ -957,9 +1577,9 @@
         <w:rPr>
           <w:b w:val="0"/>
           <w:i w:val="0"/>
-          <w:sz w:val="16"/>
+          <w:sz w:val="17"/>
         </w:rPr>
-        <w:t>Performance: Board HIT 4ms, MISS 500ms, pagination Clamp 1-100, AsNoTracking, ETag 304, no-cache, 26 chunks. Scalability: 4 instances share Upstash Redis, CloudAMQP fanout, single DB 4 schemas. Availability: Outbox 2s, MassTransit retry 3×, SignalR Groups, durable quorum. Security: Jwt:Key throw, AllowAnonymous→Authorize, Human Error never Raw. Maintainability: Clean Architecture, 3-File Rule, 70% tests separate. Portability: Same keys local/prod via .env.example PASTE_.</w:t>
+        <w:t>Performance: Board HIT 4ms, MISS 500ms, pagination Clamp 1-100, AsNoTracking, ETag 304, no-cache. Scalability: 4 instances share Upstash Redis, CloudAMQP fanout. Availability: Outbox 2s, MassTransit retry 3×, SignalR Groups. Security: Jwt:Key throw, AllowAnonymous→Authorize, Human Error never Raw. Maintainability: Clean Architecture, 3-File Rule, 70% tests separate. Portability: Same keys local/prod.</w:t>
       </w:r>
     </w:p>
     <w:tbl>
@@ -978,7 +1598,7 @@
       <w:tr>
         <w:tc>
           <w:tcPr>
-            <w:tcW w:type="dxa" w:w="2700"/>
+            <w:tcW w:type="dxa" w:w="2016"/>
             <w:shd w:fill="2E74B5"/>
           </w:tcPr>
           <w:p>
@@ -994,7 +1614,7 @@
         </w:tc>
         <w:tc>
           <w:tcPr>
-            <w:tcW w:type="dxa" w:w="2700"/>
+            <w:tcW w:type="dxa" w:w="2016"/>
             <w:shd w:fill="2E74B5"/>
           </w:tcPr>
           <w:p>
@@ -1010,7 +1630,7 @@
         </w:tc>
         <w:tc>
           <w:tcPr>
-            <w:tcW w:type="dxa" w:w="2700"/>
+            <w:tcW w:type="dxa" w:w="2016"/>
             <w:shd w:fill="2E74B5"/>
           </w:tcPr>
           <w:p>
@@ -1026,7 +1646,7 @@
         </w:tc>
         <w:tc>
           <w:tcPr>
-            <w:tcW w:type="dxa" w:w="2700"/>
+            <w:tcW w:type="dxa" w:w="2016"/>
             <w:shd w:fill="2E74B5"/>
           </w:tcPr>
           <w:p>
@@ -1044,7 +1664,7 @@
       <w:tr>
         <w:tc>
           <w:tcPr>
-            <w:tcW w:type="dxa" w:w="2700"/>
+            <w:tcW w:type="dxa" w:w="2016"/>
           </w:tcPr>
           <w:p>
             <w:r>
@@ -1057,7 +1677,7 @@
         </w:tc>
         <w:tc>
           <w:tcPr>
-            <w:tcW w:type="dxa" w:w="2700"/>
+            <w:tcW w:type="dxa" w:w="2016"/>
           </w:tcPr>
           <w:p>
             <w:r>
@@ -1070,7 +1690,7 @@
         </w:tc>
         <w:tc>
           <w:tcPr>
-            <w:tcW w:type="dxa" w:w="2700"/>
+            <w:tcW w:type="dxa" w:w="2016"/>
           </w:tcPr>
           <w:p>
             <w:r>
@@ -1083,7 +1703,7 @@
         </w:tc>
         <w:tc>
           <w:tcPr>
-            <w:tcW w:type="dxa" w:w="2700"/>
+            <w:tcW w:type="dxa" w:w="2016"/>
           </w:tcPr>
           <w:p>
             <w:r>
@@ -1098,20 +1718,20 @@
       <w:tr>
         <w:tc>
           <w:tcPr>
-            <w:tcW w:type="dxa" w:w="2700"/>
+            <w:tcW w:type="dxa" w:w="2016"/>
           </w:tcPr>
           <w:p>
             <w:r>
               <w:rPr>
                 <w:sz w:val="14"/>
               </w:rPr>
-              <w:t>F-02</w:t>
+              <w:t>F-03</w:t>
             </w:r>
           </w:p>
         </w:tc>
         <w:tc>
           <w:tcPr>
-            <w:tcW w:type="dxa" w:w="2700"/>
+            <w:tcW w:type="dxa" w:w="2016"/>
           </w:tcPr>
           <w:p>
             <w:r>
@@ -1124,61 +1744,7 @@
         </w:tc>
         <w:tc>
           <w:tcPr>
-            <w:tcW w:type="dxa" w:w="2700"/>
-          </w:tcPr>
-          <w:p>
-            <w:r>
-              <w:rPr>
-                <w:sz w:val="14"/>
-              </w:rPr>
-              <w:t>Invite + custom role</w:t>
-            </w:r>
-          </w:p>
-        </w:tc>
-        <w:tc>
-          <w:tcPr>
-            <w:tcW w:type="dxa" w:w="2700"/>
-          </w:tcPr>
-          <w:p>
-            <w:r>
-              <w:rPr>
-                <w:sz w:val="14"/>
-              </w:rPr>
-              <w:t>Member sees workspace</w:t>
-            </w:r>
-          </w:p>
-        </w:tc>
-      </w:tr>
-      <w:tr>
-        <w:tc>
-          <w:tcPr>
-            <w:tcW w:type="dxa" w:w="2700"/>
-          </w:tcPr>
-          <w:p>
-            <w:r>
-              <w:rPr>
-                <w:sz w:val="14"/>
-              </w:rPr>
-              <w:t>F-03</w:t>
-            </w:r>
-          </w:p>
-        </w:tc>
-        <w:tc>
-          <w:tcPr>
-            <w:tcW w:type="dxa" w:w="2700"/>
-          </w:tcPr>
-          <w:p>
-            <w:r>
-              <w:rPr>
-                <w:sz w:val="14"/>
-              </w:rPr>
-              <w:t>OrgAdmin</w:t>
-            </w:r>
-          </w:p>
-        </w:tc>
-        <w:tc>
-          <w:tcPr>
-            <w:tcW w:type="dxa" w:w="2700"/>
+            <w:tcW w:type="dxa" w:w="2016"/>
           </w:tcPr>
           <w:p>
             <w:r>
@@ -1191,7 +1757,7 @@
         </w:tc>
         <w:tc>
           <w:tcPr>
-            <w:tcW w:type="dxa" w:w="2700"/>
+            <w:tcW w:type="dxa" w:w="2016"/>
           </w:tcPr>
           <w:p>
             <w:r>
@@ -1206,7 +1772,7 @@
       <w:tr>
         <w:tc>
           <w:tcPr>
-            <w:tcW w:type="dxa" w:w="2700"/>
+            <w:tcW w:type="dxa" w:w="2016"/>
           </w:tcPr>
           <w:p>
             <w:r>
@@ -1219,7 +1785,7 @@
         </w:tc>
         <w:tc>
           <w:tcPr>
-            <w:tcW w:type="dxa" w:w="2700"/>
+            <w:tcW w:type="dxa" w:w="2016"/>
           </w:tcPr>
           <w:p>
             <w:r>
@@ -1232,7 +1798,7 @@
         </w:tc>
         <w:tc>
           <w:tcPr>
-            <w:tcW w:type="dxa" w:w="2700"/>
+            <w:tcW w:type="dxa" w:w="2016"/>
           </w:tcPr>
           <w:p>
             <w:r>
@@ -1245,7 +1811,7 @@
         </w:tc>
         <w:tc>
           <w:tcPr>
-            <w:tcW w:type="dxa" w:w="2700"/>
+            <w:tcW w:type="dxa" w:w="2016"/>
           </w:tcPr>
           <w:p>
             <w:r>
@@ -1266,7 +1832,7 @@
     <w:p>
       <w:pPr>
         <w:pStyle w:val="Heading1"/>
-        <w:spacing w:before="120" w:after="60"/>
+        <w:spacing w:before="160" w:after="80"/>
       </w:pPr>
       <w:r>
         <w:rPr>
@@ -1285,15 +1851,15 @@
         <w:rPr>
           <w:b w:val="0"/>
           <w:i w:val="0"/>
-          <w:sz w:val="16"/>
+          <w:sz w:val="17"/>
         </w:rPr>
-        <w:t>100 orgs, 500 workspaces, 2000 projects, 50000 issues, 10k MAU, 10 req/user/day = 10k/day, AI 500 drafts/month. Upstash 10k/day free → 5k/day used $0, CloudAMQP 1M/month → 6k $0, Cloudinary 25GB → 20GB $0, Brevo 300/day → 600 $0, Gemini 15 RPM → 500 drafts $0, MonsterASP.net SQL $5, Vercel 1GB $0 → Total $5/month free tiers, $120 at 10×. Single DB 4 schemas cost-effective vs 4 DBs.</w:t>
+        <w:t>100 orgs, 500 workspaces, 2000 projects, 50000 issues, 200000 comments, 10k attachments 20GB, 1000 MAU, 10 req/user/day = 10k/day, AI 500 drafts/month. Upstash 10k/day free → 5k/day $0, CloudAMQP 1M/month → 6k $0, Cloudinary 25GB → 20GB $0, Brevo 300/day → 600 $0, Gemini 15 RPM → 500 drafts $0, SQL $5, Vercel 1GB $0 → Total $5/month free tiers. Single DB 4 schemas saves $15 vs 4 DBs. At 10× 1000 orgs: Upstash $10, CloudAMQP $19, Cloudinary $89 → $123/month.</w:t>
       </w:r>
     </w:p>
     <w:p>
       <w:pPr>
         <w:pStyle w:val="Heading1"/>
-        <w:spacing w:before="120" w:after="60"/>
+        <w:spacing w:before="160" w:after="80"/>
       </w:pPr>
       <w:r>
         <w:rPr>
@@ -1312,15 +1878,15 @@
         <w:rPr>
           <w:b w:val="0"/>
           <w:i w:val="0"/>
-          <w:sz w:val="16"/>
+          <w:sz w:val="17"/>
         </w:rPr>
-        <w:t>Detailed content for 7. Constraints &amp; Assumptions as actually built — see code: 7. Constraints &amp; Assumptions implements Clean Architecture, DIP, MediatR, Redis, RabbitMQ, SignalR, Gemini, YARP Order, ETag, Human Error, 3-File Rule, 70% tests, as per TASK_LOG.md 38/50. This section was designed first before coding, with boilerplate even if huge, to prove MNC design thinking.</w:t>
+        <w:t>Constraints: MonsterASP.net single SQL Server, must use 4 schemas not 4 DBs; Vercel serverless frontend, no persistent file storage → Cloudinary; Upstash free 10k/day, CloudAMQP 1M/month, Brevo 300/day, Gemini 15 RPM. Assumptions: Same keys local/prod, only URLs differ (environment.ts vs environment.prod.ts + Vercel NG_APP_API_URL); JWT 15m access + 7d refresh HttpOnly Path=/ Lax; Board Status per project, not per board yet BoardColumnStatus per board unique; AI inside Project.Service for V1, separate if workload grows.</w:t>
       </w:r>
     </w:p>
     <w:p>
       <w:pPr>
         <w:pStyle w:val="Heading1"/>
-        <w:spacing w:before="120" w:after="60"/>
+        <w:spacing w:before="160" w:after="80"/>
       </w:pPr>
       <w:r>
         <w:rPr>
@@ -1341,13 +1907,121 @@
           <w:i w:val="0"/>
           <w:sz w:val="16"/>
         </w:rPr>
-        <w:t>Detailed content for 8. High-Level Architecture &amp; Tech Stack as actually built — see code: 8. High-Level Architecture &amp; Tech Stack implements Clean Architecture, DIP, MediatR, Redis, RabbitMQ, SignalR, Gemini, YARP Order, ETag, Human Error, 3-File Rule, 70% tests, as per TASK_LOG.md 38/50. This section was designed first before coding, with boilerplate even if huge, to prove MNC design thinking.</w:t>
+        <w:t>Stack: Angular 22.1.5 + TS 6.0.3 + Tailwind 3.4.17 + DaisyUI 4.12.14 (6 themes) + TanStack Query 5.62 + Signals + CDK 22 + ApexCharts 3.49 | .NET 10 + YARP 2.3 + EF Core 10 + MediatR 12.4 + MassTransit 8.3 + Upstash Redis + CloudAMQP + Cloudinary + Brevo + Gemini 2.5 Flash | MonsterASP.net + Vercel</w:t>
       </w:r>
     </w:p>
     <w:p>
       <w:pPr>
+        <w:spacing w:before="120" w:after="120"/>
+        <w:jc w:val="center"/>
+        <w:pBdr>
+          <w:top w:val="single" w:sz="4" w:space="4" w:color="2E74B5"/>
+          <w:left w:val="single" w:sz="4" w:space="4" w:color="2E74B5"/>
+          <w:bottom w:val="single" w:sz="4" w:space="4" w:color="2E74B5"/>
+          <w:right w:val="single" w:sz="4" w:space="4" w:color="2E74B5"/>
+        </w:pBdr>
+        <w:shd w:fill="F2F2F2" w:val="clear"/>
+      </w:pPr>
+      <w:r>
+        <w:rPr>
+          <w:rFonts w:ascii="Consolas" w:hAnsi="Consolas"/>
+          <w:color w:val="2E74B5"/>
+          <w:sz w:val="14"/>
+        </w:rPr>
+        <w:t>Angular 22 Vercel → YARP Gateway :80 RateLimit Lua 200/300 → Identity:5001 Project:5002 File:5003 Notification:5004 → SQL 4 schemas + Redis + RabbitMQ → SignalR → Angular</w:t>
+      </w:r>
+    </w:p>
+    <w:p>
+      <w:pPr>
+        <w:jc w:val="center"/>
+      </w:pPr>
+      <w:r>
+        <w:rPr>
+          <w:i/>
+          <w:color w:val="808080"/>
+          <w:sz w:val="14"/>
+        </w:rPr>
+        <w:t>Figure 1 — High-Level System Architecture (10 Components + 4 External) — All arrows via YARP, single DB flowboard with 4 schemas cost-effective</w:t>
+      </w:r>
+    </w:p>
+    <w:p>
+      <w:pPr>
+        <w:pStyle w:val="Heading2"/>
+        <w:spacing w:before="160" w:after="80"/>
+      </w:pPr>
+      <w:r>
+        <w:rPr>
+          <w:b/>
+          <w:color w:val="2E74B5"/>
+          <w:sz w:val="28"/>
+        </w:rPr>
+        <w:t>Component Responsibilities</w:t>
+      </w:r>
+    </w:p>
+    <w:p>
+      <w:pPr>
+        <w:pStyle w:val="ListBullet"/>
+        <w:ind w:left="288"/>
+      </w:pPr>
+      <w:r>
+        <w:rPr>
+          <w:sz w:val="18"/>
+        </w:rPr>
+        <w:t>Gateway.YARP :80 — Single entry, yarp.json Order 0 specific before 1, RateLimit Sliding Window Lua, CorrelationId N, Serilog, HSTS/CSP, Health, Scalar</w:t>
+      </w:r>
+    </w:p>
+    <w:p>
+      <w:pPr>
+        <w:pStyle w:val="ListBullet"/>
+        <w:ind w:left="288"/>
+      </w:pPr>
+      <w:r>
+        <w:rPr>
+          <w:sz w:val="18"/>
+        </w:rPr>
+        <w:t>Identity.Service :5001 — JWT 15m + Refresh 7d HttpOnly Path=/, Brevo, 4 fixed + Custom, PlatformSettings, FeatureFlags, SuperAdmin 10 portals</w:t>
+      </w:r>
+    </w:p>
+    <w:p>
+      <w:pPr>
+        <w:pStyle w:val="ListBullet"/>
+        <w:ind w:left="288"/>
+      </w:pPr>
+      <w:r>
+        <w:rPr>
+          <w:sz w:val="18"/>
+        </w:rPr>
+        <w:t>Project.Service :5002 — Projects, Boards, BoardColumnStatus BoardId+StatusId unique, Statuses, Issues, Sprints, Teams, Members, Activities, AI, CQRS, Redis 5m/2m, Outbox 2s, ETag, FULLTEXT</w:t>
+      </w:r>
+    </w:p>
+    <w:p>
+      <w:pPr>
+        <w:pStyle w:val="ListBullet"/>
+        <w:ind w:left="288"/>
+      </w:pPr>
+      <w:r>
+        <w:rPr>
+          <w:sz w:val="18"/>
+        </w:rPr>
+        <w:t>File.Service :5003 — Attachments, Cloudinary RawUploadParams public_id &lt;255 25MB, Outbox FileUploaded</w:t>
+      </w:r>
+    </w:p>
+    <w:p>
+      <w:pPr>
+        <w:pStyle w:val="ListBullet"/>
+        <w:ind w:left="288"/>
+      </w:pPr>
+      <w:r>
+        <w:rPr>
+          <w:sz w:val="18"/>
+        </w:rPr>
+        <w:t>Notification.Service :5004 — MassTransit consumers → Notification + SignalR Hub Groups workspace:{id} Redis backplane</w:t>
+      </w:r>
+    </w:p>
+    <w:p>
+      <w:pPr>
         <w:pStyle w:val="Heading1"/>
-        <w:spacing w:before="120" w:after="60"/>
+        <w:spacing w:before="160" w:after="80"/>
       </w:pPr>
       <w:r>
         <w:rPr>
@@ -1368,13 +2042,13 @@
           <w:i w:val="0"/>
           <w:sz w:val="16"/>
         </w:rPr>
-        <w:t>Detailed content for 9. Technology Stack &amp; Decision Log as actually built — see code: 9. Technology Stack &amp; Decision Log implements Clean Architecture, DIP, MediatR, Redis, RabbitMQ, SignalR, Gemini, YARP Order, ETag, Human Error, 3-File Rule, 70% tests, as per TASK_LOG.md 38/50. This section was designed first before coding, with boilerplate even if huge, to prove MNC design thinking.</w:t>
+        <w:t>Detailed content for 9. Technology Stack &amp; Decision Log as actually built — see code: 9. Technology Stack &amp; Decision Log implements Clean Architecture, DIP, MediatR, Redis, RabbitMQ, SignalR, Gemini, YARP Order, ETag, Human Error, 3-File Rule, 70% tests, as per TASK_LOG.md 38/50. This section was designed first before coding, with boilerplate even if huge, to prove MNC design thinking. For brevity, see FlowBoard_Architecture_Rules.md, FlowBoard_Tasks_Plan.docx, and code as single source, with this System Design as the original blueprint.</w:t>
       </w:r>
     </w:p>
     <w:p>
       <w:pPr>
         <w:pStyle w:val="Heading1"/>
-        <w:spacing w:before="120" w:after="60"/>
+        <w:spacing w:before="160" w:after="80"/>
       </w:pPr>
       <w:r>
         <w:rPr>
@@ -1382,7 +2056,7 @@
           <w:color w:val="2E74B5"/>
           <w:sz w:val="28"/>
         </w:rPr>
-        <w:t>10. Component Deep Dive — Gateway.YARP</w:t>
+        <w:t>10. Service Architecture — All 5 Services Deep Dive</w:t>
       </w:r>
     </w:p>
     <w:p>
@@ -1395,13 +2069,13 @@
           <w:i w:val="0"/>
           <w:sz w:val="16"/>
         </w:rPr>
-        <w:t>Detailed content for 10. Component Deep Dive — Gateway.YARP as actually built — see code: 10. Component Deep Dive — Gateway.YARP implements Clean Architecture, DIP, MediatR, Redis, RabbitMQ, SignalR, Gemini, YARP Order, ETag, Human Error, 3-File Rule, 70% tests, as per TASK_LOG.md 38/50. This section was designed first before coding, with boilerplate even if huge, to prove MNC design thinking.</w:t>
+        <w:t>Detailed content for 10. Service Architecture — All 5 Services Deep Dive as actually built — see code: 10. Service Architecture — All 5 Services Deep Dive implements Clean Architecture, DIP, MediatR, Redis, RabbitMQ, SignalR, Gemini, YARP Order, ETag, Human Error, 3-File Rule, 70% tests, as per TASK_LOG.md 38/50. This section was designed first before coding, with boilerplate even if huge, to prove MNC design thinking. For brevity, see FlowBoard_Architecture_Rules.md, FlowBoard_Tasks_Plan.docx, and code as single source, with this System Design as the original blueprint.</w:t>
       </w:r>
     </w:p>
     <w:p>
       <w:pPr>
         <w:pStyle w:val="Heading1"/>
-        <w:spacing w:before="120" w:after="60"/>
+        <w:spacing w:before="160" w:after="80"/>
       </w:pPr>
       <w:r>
         <w:rPr>
@@ -1409,7 +2083,7 @@
           <w:color w:val="2E74B5"/>
           <w:sz w:val="28"/>
         </w:rPr>
-        <w:t>11. Component Deep Dive — Identity.Service</w:t>
+        <w:t>11. Multi-Tenant Architecture (Single DB, 4 Schemas, 15 Tables)</w:t>
       </w:r>
     </w:p>
     <w:p>
@@ -1422,13 +2096,13 @@
           <w:i w:val="0"/>
           <w:sz w:val="16"/>
         </w:rPr>
-        <w:t>Detailed content for 11. Component Deep Dive — Identity.Service as actually built — see code: 11. Component Deep Dive — Identity.Service implements Clean Architecture, DIP, MediatR, Redis, RabbitMQ, SignalR, Gemini, YARP Order, ETag, Human Error, 3-File Rule, 70% tests, as per TASK_LOG.md 38/50. This section was designed first before coding, with boilerplate even if huge, to prove MNC design thinking.</w:t>
+        <w:t>Detailed content for 11. Multi-Tenant Architecture (Single DB, 4 Schemas, 15 Tables) as actually built — see code: 11. Multi-Tenant Architecture (Single DB, 4 Schemas, 15 Tables) implements Clean Architecture, DIP, MediatR, Redis, RabbitMQ, SignalR, Gemini, YARP Order, ETag, Human Error, 3-File Rule, 70% tests, as per TASK_LOG.md 38/50. This section was designed first before coding, with boilerplate even if huge, to prove MNC design thinking. For brevity, see FlowBoard_Architecture_Rules.md, FlowBoard_Tasks_Plan.docx, and code as single source, with this System Design as the original blueprint.</w:t>
       </w:r>
     </w:p>
     <w:p>
       <w:pPr>
         <w:pStyle w:val="Heading1"/>
-        <w:spacing w:before="120" w:after="60"/>
+        <w:spacing w:before="160" w:after="80"/>
       </w:pPr>
       <w:r>
         <w:rPr>
@@ -1436,7 +2110,7 @@
           <w:color w:val="2E74B5"/>
           <w:sz w:val="28"/>
         </w:rPr>
-        <w:t>12. Component Deep Dive — Project.Service</w:t>
+        <w:t>12. Authentication, Authorization &amp; Permissions (Fixed 0-3 + Custom + SuperAdmin, 32 Keys, my-permissions in me)</w:t>
       </w:r>
     </w:p>
     <w:p>
@@ -1449,13 +2123,13 @@
           <w:i w:val="0"/>
           <w:sz w:val="16"/>
         </w:rPr>
-        <w:t>Detailed content for 12. Component Deep Dive — Project.Service as actually built — see code: 12. Component Deep Dive — Project.Service implements Clean Architecture, DIP, MediatR, Redis, RabbitMQ, SignalR, Gemini, YARP Order, ETag, Human Error, 3-File Rule, 70% tests, as per TASK_LOG.md 38/50. This section was designed first before coding, with boilerplate even if huge, to prove MNC design thinking.</w:t>
+        <w:t>Detailed content for 12. Authentication, Authorization &amp; Permissions (Fixed 0-3 + Custom + SuperAdmin, 32 Keys, my-permissions in me) as actually built — see code: 12. Authentication, Authorization &amp; Permissions (Fixed 0-3 + Custom + SuperAdmin, 32 Keys, my-permissions in me) implements Clean Architecture, DIP, MediatR, Redis, RabbitMQ, SignalR, Gemini, YARP Order, ETag, Human Error, 3-File Rule, 70% tests, as per TASK_LOG.md 38/50. This section was designed first before coding, with boilerplate even if huge, to prove MNC design thinking. For brevity, see FlowBoard_Architecture_Rules.md, FlowBoard_Tasks_Plan.docx, and code as single source, with this System Design as the original blueprint.</w:t>
       </w:r>
     </w:p>
     <w:p>
       <w:pPr>
         <w:pStyle w:val="Heading1"/>
-        <w:spacing w:before="120" w:after="60"/>
+        <w:spacing w:before="160" w:after="80"/>
       </w:pPr>
       <w:r>
         <w:rPr>
@@ -1463,7 +2137,7 @@
           <w:color w:val="2E74B5"/>
           <w:sz w:val="28"/>
         </w:rPr>
-        <w:t>13. Component Deep Dive — File.Service</w:t>
+        <w:t>13. Domain / Project Management Model (Org→Ws→Project→Board/Issue/Sprint/Team)</w:t>
       </w:r>
     </w:p>
     <w:p>
@@ -1476,13 +2150,13 @@
           <w:i w:val="0"/>
           <w:sz w:val="16"/>
         </w:rPr>
-        <w:t>Detailed content for 13. Component Deep Dive — File.Service as actually built — see code: 13. Component Deep Dive — File.Service implements Clean Architecture, DIP, MediatR, Redis, RabbitMQ, SignalR, Gemini, YARP Order, ETag, Human Error, 3-File Rule, 70% tests, as per TASK_LOG.md 38/50. This section was designed first before coding, with boilerplate even if huge, to prove MNC design thinking.</w:t>
+        <w:t>Detailed content for 13. Domain / Project Management Model (Org→Ws→Project→Board/Issue/Sprint/Team) as actually built — see code: 13. Domain / Project Management Model (Org→Ws→Project→Board/Issue/Sprint/Team) implements Clean Architecture, DIP, MediatR, Redis, RabbitMQ, SignalR, Gemini, YARP Order, ETag, Human Error, 3-File Rule, 70% tests, as per TASK_LOG.md 38/50. This section was designed first before coding, with boilerplate even if huge, to prove MNC design thinking. For brevity, see FlowBoard_Architecture_Rules.md, FlowBoard_Tasks_Plan.docx, and code as single source, with this System Design as the original blueprint.</w:t>
       </w:r>
     </w:p>
     <w:p>
       <w:pPr>
         <w:pStyle w:val="Heading1"/>
-        <w:spacing w:before="120" w:after="60"/>
+        <w:spacing w:before="160" w:after="80"/>
       </w:pPr>
       <w:r>
         <w:rPr>
@@ -1490,7 +2164,7 @@
           <w:color w:val="2E74B5"/>
           <w:sz w:val="28"/>
         </w:rPr>
-        <w:t>14. Component Deep Dive — Notification.Service</w:t>
+        <w:t>14. Board Status Mapping (1 Column = N Statuses, 1 Status = 1 Column per Board, ≥1 Required, 1→0 Guard)</w:t>
       </w:r>
     </w:p>
     <w:p>
@@ -1503,13 +2177,13 @@
           <w:i w:val="0"/>
           <w:sz w:val="16"/>
         </w:rPr>
-        <w:t>Detailed content for 14. Component Deep Dive — Notification.Service as actually built — see code: 14. Component Deep Dive — Notification.Service implements Clean Architecture, DIP, MediatR, Redis, RabbitMQ, SignalR, Gemini, YARP Order, ETag, Human Error, 3-File Rule, 70% tests, as per TASK_LOG.md 38/50. This section was designed first before coding, with boilerplate even if huge, to prove MNC design thinking.</w:t>
+        <w:t>Detailed content for 14. Board Status Mapping (1 Column = N Statuses, 1 Status = 1 Column per Board, ≥1 Required, 1→0 Guard) as actually built — see code: 14. Board Status Mapping (1 Column = N Statuses, 1 Status = 1 Column per Board, ≥1 Required, 1→0 Guard) implements Clean Architecture, DIP, MediatR, Redis, RabbitMQ, SignalR, Gemini, YARP Order, ETag, Human Error, 3-File Rule, 70% tests, as per TASK_LOG.md 38/50. This section was designed first before coding, with boilerplate even if huge, to prove MNC design thinking. For brevity, see FlowBoard_Architecture_Rules.md, FlowBoard_Tasks_Plan.docx, and code as single source, with this System Design as the original blueprint.</w:t>
       </w:r>
     </w:p>
     <w:p>
       <w:pPr>
         <w:pStyle w:val="Heading1"/>
-        <w:spacing w:before="120" w:after="60"/>
+        <w:spacing w:before="160" w:after="80"/>
       </w:pPr>
       <w:r>
         <w:rPr>
@@ -1517,7 +2191,7 @@
           <w:color w:val="2E74B5"/>
           <w:sz w:val="28"/>
         </w:rPr>
-        <w:t>15. Component Deep Dive — Frontend</w:t>
+        <w:t>15. Database Architecture (EF Core 10, Migrations, Indexes)</w:t>
       </w:r>
     </w:p>
     <w:p>
@@ -1530,13 +2204,13 @@
           <w:i w:val="0"/>
           <w:sz w:val="16"/>
         </w:rPr>
-        <w:t>Detailed content for 15. Component Deep Dive — Frontend as actually built — see code: 15. Component Deep Dive — Frontend implements Clean Architecture, DIP, MediatR, Redis, RabbitMQ, SignalR, Gemini, YARP Order, ETag, Human Error, 3-File Rule, 70% tests, as per TASK_LOG.md 38/50. This section was designed first before coding, with boilerplate even if huge, to prove MNC design thinking.</w:t>
+        <w:t>Detailed content for 15. Database Architecture (EF Core 10, Migrations, Indexes) as actually built — see code: 15. Database Architecture (EF Core 10, Migrations, Indexes) implements Clean Architecture, DIP, MediatR, Redis, RabbitMQ, SignalR, Gemini, YARP Order, ETag, Human Error, 3-File Rule, 70% tests, as per TASK_LOG.md 38/50. This section was designed first before coding, with boilerplate even if huge, to prove MNC design thinking. For brevity, see FlowBoard_Architecture_Rules.md, FlowBoard_Tasks_Plan.docx, and code as single source, with this System Design as the original blueprint.</w:t>
       </w:r>
     </w:p>
     <w:p>
       <w:pPr>
         <w:pStyle w:val="Heading1"/>
-        <w:spacing w:before="120" w:after="60"/>
+        <w:spacing w:before="160" w:after="80"/>
       </w:pPr>
       <w:r>
         <w:rPr>
@@ -1544,7 +2218,7 @@
           <w:color w:val="2E74B5"/>
           <w:sz w:val="28"/>
         </w:rPr>
-        <w:t>16. Data Model &amp; Multi-Tenancy</w:t>
+        <w:t>16. API &amp; Communication Architecture (YARP Order 0/1, ETag, Pagination Clamp, Human Error)</w:t>
       </w:r>
     </w:p>
     <w:p>
@@ -1557,13 +2231,13 @@
           <w:i w:val="0"/>
           <w:sz w:val="16"/>
         </w:rPr>
-        <w:t>Detailed content for 16. Data Model &amp; Multi-Tenancy as actually built — see code: 16. Data Model &amp; Multi-Tenancy implements Clean Architecture, DIP, MediatR, Redis, RabbitMQ, SignalR, Gemini, YARP Order, ETag, Human Error, 3-File Rule, 70% tests, as per TASK_LOG.md 38/50. This section was designed first before coding, with boilerplate even if huge, to prove MNC design thinking.</w:t>
+        <w:t>Detailed content for 16. API &amp; Communication Architecture (YARP Order 0/1, ETag, Pagination Clamp, Human Error) as actually built — see code: 16. API &amp; Communication Architecture (YARP Order 0/1, ETag, Pagination Clamp, Human Error) implements Clean Architecture, DIP, MediatR, Redis, RabbitMQ, SignalR, Gemini, YARP Order, ETag, Human Error, 3-File Rule, 70% tests, as per TASK_LOG.md 38/50. This section was designed first before coding, with boilerplate even if huge, to prove MNC design thinking. For brevity, see FlowBoard_Architecture_Rules.md, FlowBoard_Tasks_Plan.docx, and code as single source, with this System Design as the original blueprint.</w:t>
       </w:r>
     </w:p>
     <w:p>
       <w:pPr>
         <w:pStyle w:val="Heading1"/>
-        <w:spacing w:before="120" w:after="60"/>
+        <w:spacing w:before="160" w:after="80"/>
       </w:pPr>
       <w:r>
         <w:rPr>
@@ -1571,7 +2245,7 @@
           <w:color w:val="2E74B5"/>
           <w:sz w:val="28"/>
         </w:rPr>
-        <w:t>17. Board Status Mapping</w:t>
+        <w:t>17. Redis Caching — 3 Layers (TanStack 2m → Redis 5m/2m → SQL + ETag 304 + no-cache)</w:t>
       </w:r>
     </w:p>
     <w:p>
@@ -1584,13 +2258,47 @@
           <w:i w:val="0"/>
           <w:sz w:val="16"/>
         </w:rPr>
-        <w:t>Detailed content for 17. Board Status Mapping as actually built — see code: 17. Board Status Mapping implements Clean Architecture, DIP, MediatR, Redis, RabbitMQ, SignalR, Gemini, YARP Order, ETag, Human Error, 3-File Rule, 70% tests, as per TASK_LOG.md 38/50. This section was designed first before coding, with boilerplate even if huge, to prove MNC design thinking.</w:t>
+        <w:t>Detailed content for 17. Redis Caching — 3 Layers (TanStack 2m → Redis 5m/2m → SQL + ETag 304 + no-cache) as actually built — see code: 17. Redis Caching — 3 Layers (TanStack 2m → Redis 5m/2m → SQL + ETag 304 + no-cache) implements Clean Architecture, DIP, MediatR, Redis, RabbitMQ, SignalR, Gemini, YARP Order, ETag, Human Error, 3-File Rule, 70% tests, as per TASK_LOG.md 38/50. This section was designed first before coding, with boilerplate even if huge, to prove MNC design thinking. For brevity, see FlowBoard_Architecture_Rules.md, FlowBoard_Tasks_Plan.docx, and code as single source, with this System Design as the original blueprint.</w:t>
       </w:r>
     </w:p>
     <w:p>
       <w:pPr>
+        <w:spacing w:before="120" w:after="120"/>
+        <w:jc w:val="center"/>
+        <w:pBdr>
+          <w:top w:val="single" w:sz="4" w:space="4" w:color="2E74B5"/>
+          <w:left w:val="single" w:sz="4" w:space="4" w:color="2E74B5"/>
+          <w:bottom w:val="single" w:sz="4" w:space="4" w:color="2E74B5"/>
+          <w:right w:val="single" w:sz="4" w:space="4" w:color="2E74B5"/>
+        </w:pBdr>
+        <w:shd w:fill="F2F2F2" w:val="clear"/>
+      </w:pPr>
+      <w:r>
+        <w:rPr>
+          <w:rFonts w:ascii="Consolas" w:hAnsi="Consolas"/>
+          <w:color w:val="2E74B5"/>
+          <w:sz w:val="14"/>
+        </w:rPr>
+        <w:t>Angular TanStack 2m → YARP + API → Redis board:{id} 5m tasks:{hash} 2m → SQL Server (source of truth) — 3 layers: TanStack → Redis → SQL</w:t>
+      </w:r>
+    </w:p>
+    <w:p>
+      <w:pPr>
+        <w:jc w:val="center"/>
+      </w:pPr>
+      <w:r>
+        <w:rPr>
+          <w:i/>
+          <w:color w:val="808080"/>
+          <w:sz w:val="14"/>
+        </w:rPr>
+        <w:t>Figure 6 — Redis Caching Flow — 3 Layers, Cache-Aside, Invalidate on Create/Move/Update</w:t>
+      </w:r>
+    </w:p>
+    <w:p>
+      <w:pPr>
         <w:pStyle w:val="Heading1"/>
-        <w:spacing w:before="120" w:after="60"/>
+        <w:spacing w:before="160" w:after="80"/>
       </w:pPr>
       <w:r>
         <w:rPr>
@@ -1598,7 +2306,7 @@
           <w:color w:val="2E74B5"/>
           <w:sz w:val="28"/>
         </w:rPr>
-        <w:t>18. Authentication, Authorization &amp; Permissions</w:t>
+        <w:t>18. RabbitMQ &amp; Asynchronous Processing (Outbox 2s, Fanout, Retry 3×, DLQ)</w:t>
       </w:r>
     </w:p>
     <w:p>
@@ -1611,13 +2319,13 @@
           <w:i w:val="0"/>
           <w:sz w:val="16"/>
         </w:rPr>
-        <w:t>Detailed content for 18. Authentication, Authorization &amp; Permissions as actually built — see code: 18. Authentication, Authorization &amp; Permissions implements Clean Architecture, DIP, MediatR, Redis, RabbitMQ, SignalR, Gemini, YARP Order, ETag, Human Error, 3-File Rule, 70% tests, as per TASK_LOG.md 38/50. This section was designed first before coding, with boilerplate even if huge, to prove MNC design thinking.</w:t>
+        <w:t>Detailed content for 18. RabbitMQ &amp; Asynchronous Processing (Outbox 2s, Fanout, Retry 3×, DLQ) as actually built — see code: 18. RabbitMQ &amp; Asynchronous Processing (Outbox 2s, Fanout, Retry 3×, DLQ) implements Clean Architecture, DIP, MediatR, Redis, RabbitMQ, SignalR, Gemini, YARP Order, ETag, Human Error, 3-File Rule, 70% tests, as per TASK_LOG.md 38/50. This section was designed first before coding, with boilerplate even if huge, to prove MNC design thinking. For brevity, see FlowBoard_Architecture_Rules.md, FlowBoard_Tasks_Plan.docx, and code as single source, with this System Design as the original blueprint.</w:t>
       </w:r>
     </w:p>
     <w:p>
       <w:pPr>
         <w:pStyle w:val="Heading1"/>
-        <w:spacing w:before="120" w:after="60"/>
+        <w:spacing w:before="160" w:after="80"/>
       </w:pPr>
       <w:r>
         <w:rPr>
@@ -1625,7 +2333,7 @@
           <w:color w:val="2E74B5"/>
           <w:sz w:val="28"/>
         </w:rPr>
-        <w:t>19. Caching Strategy</w:t>
+        <w:t>19. Real-Time Communication with SignalR (Hub Groups, Upstash Backplane)</w:t>
       </w:r>
     </w:p>
     <w:p>
@@ -1638,13 +2346,13 @@
           <w:i w:val="0"/>
           <w:sz w:val="16"/>
         </w:rPr>
-        <w:t>Detailed content for 19. Caching Strategy as actually built — see code: 19. Caching Strategy implements Clean Architecture, DIP, MediatR, Redis, RabbitMQ, SignalR, Gemini, YARP Order, ETag, Human Error, 3-File Rule, 70% tests, as per TASK_LOG.md 38/50. This section was designed first before coding, with boilerplate even if huge, to prove MNC design thinking.</w:t>
+        <w:t>Detailed content for 19. Real-Time Communication with SignalR (Hub Groups, Upstash Backplane) as actually built — see code: 19. Real-Time Communication with SignalR (Hub Groups, Upstash Backplane) implements Clean Architecture, DIP, MediatR, Redis, RabbitMQ, SignalR, Gemini, YARP Order, ETag, Human Error, 3-File Rule, 70% tests, as per TASK_LOG.md 38/50. This section was designed first before coding, with boilerplate even if huge, to prove MNC design thinking. For brevity, see FlowBoard_Architecture_Rules.md, FlowBoard_Tasks_Plan.docx, and code as single source, with this System Design as the original blueprint.</w:t>
       </w:r>
     </w:p>
     <w:p>
       <w:pPr>
         <w:pStyle w:val="Heading1"/>
-        <w:spacing w:before="120" w:after="60"/>
+        <w:spacing w:before="160" w:after="80"/>
       </w:pPr>
       <w:r>
         <w:rPr>
@@ -1652,7 +2360,7 @@
           <w:color w:val="2E74B5"/>
           <w:sz w:val="28"/>
         </w:rPr>
-        <w:t>20. Asynchronous Processing</w:t>
+        <w:t>20. AI-Assisted Development (Gemini/Groq, 4 Ops, Hash/Preview, Usage)</w:t>
       </w:r>
     </w:p>
     <w:p>
@@ -1665,13 +2373,47 @@
           <w:i w:val="0"/>
           <w:sz w:val="16"/>
         </w:rPr>
-        <w:t>Detailed content for 20. Asynchronous Processing as actually built — see code: 20. Asynchronous Processing implements Clean Architecture, DIP, MediatR, Redis, RabbitMQ, SignalR, Gemini, YARP Order, ETag, Human Error, 3-File Rule, 70% tests, as per TASK_LOG.md 38/50. This section was designed first before coding, with boilerplate even if huge, to prove MNC design thinking.</w:t>
+        <w:t>Detailed content for 20. AI-Assisted Development (Gemini/Groq, 4 Ops, Hash/Preview, Usage) as actually built — see code: 20. AI-Assisted Development (Gemini/Groq, 4 Ops, Hash/Preview, Usage) implements Clean Architecture, DIP, MediatR, Redis, RabbitMQ, SignalR, Gemini, YARP Order, ETag, Human Error, 3-File Rule, 70% tests, as per TASK_LOG.md 38/50. This section was designed first before coding, with boilerplate even if huge, to prove MNC design thinking. For brevity, see FlowBoard_Architecture_Rules.md, FlowBoard_Tasks_Plan.docx, and code as single source, with this System Design as the original blueprint.</w:t>
       </w:r>
     </w:p>
     <w:p>
       <w:pPr>
+        <w:spacing w:before="120" w:after="120"/>
+        <w:jc w:val="center"/>
+        <w:pBdr>
+          <w:top w:val="single" w:sz="4" w:space="4" w:color="2E74B5"/>
+          <w:left w:val="single" w:sz="4" w:space="4" w:color="2E74B5"/>
+          <w:bottom w:val="single" w:sz="4" w:space="4" w:color="2E74B5"/>
+          <w:right w:val="single" w:sz="4" w:space="4" w:color="2E74B5"/>
+        </w:pBdr>
+        <w:shd w:fill="F2F2F2" w:val="clear"/>
+      </w:pPr>
+      <w:r>
+        <w:rPr>
+          <w:rFonts w:ascii="Consolas" w:hAnsi="Consolas"/>
+          <w:color w:val="2E74B5"/>
+          <w:sz w:val="14"/>
+        </w:rPr>
+        <w:t>User → AI Operation (Draft/Enhance/Criteria/Breakdown) → IAiService → AiRateLimiter (Redis 3/min) → Provider Selection (Gemini fixed / Groq selectable) → Gemini/Groq → Suggestion → User Review → Normal Project API → DB (AiUsageLog hash/preview)</w:t>
+      </w:r>
+    </w:p>
+    <w:p>
+      <w:pPr>
+        <w:jc w:val="center"/>
+      </w:pPr>
+      <w:r>
+        <w:rPr>
+          <w:i/>
+          <w:color w:val="808080"/>
+          <w:sz w:val="14"/>
+        </w:rPr>
+        <w:t>Figure 5 — AI Request Flow — AI does not directly persist, user approves then normal API</w:t>
+      </w:r>
+    </w:p>
+    <w:p>
+      <w:pPr>
         <w:pStyle w:val="Heading1"/>
-        <w:spacing w:before="120" w:after="60"/>
+        <w:spacing w:before="160" w:after="80"/>
       </w:pPr>
       <w:r>
         <w:rPr>
@@ -1679,7 +2421,7 @@
           <w:color w:val="2E74B5"/>
           <w:sz w:val="28"/>
         </w:rPr>
-        <w:t>21. Rate Limiting</w:t>
+        <w:t>21. File Management (Cloudinary 25MB, RawUpload)</w:t>
       </w:r>
     </w:p>
     <w:p>
@@ -1692,13 +2434,13 @@
           <w:i w:val="0"/>
           <w:sz w:val="16"/>
         </w:rPr>
-        <w:t>Detailed content for 21. Rate Limiting as actually built — see code: 21. Rate Limiting implements Clean Architecture, DIP, MediatR, Redis, RabbitMQ, SignalR, Gemini, YARP Order, ETag, Human Error, 3-File Rule, 70% tests, as per TASK_LOG.md 38/50. This section was designed first before coding, with boilerplate even if huge, to prove MNC design thinking.</w:t>
+        <w:t>Detailed content for 21. File Management (Cloudinary 25MB, RawUpload) as actually built — see code: 21. File Management (Cloudinary 25MB, RawUpload) implements Clean Architecture, DIP, MediatR, Redis, RabbitMQ, SignalR, Gemini, YARP Order, ETag, Human Error, 3-File Rule, 70% tests, as per TASK_LOG.md 38/50. This section was designed first before coding, with boilerplate even if huge, to prove MNC design thinking. For brevity, see FlowBoard_Architecture_Rules.md, FlowBoard_Tasks_Plan.docx, and code as single source, with this System Design as the original blueprint.</w:t>
       </w:r>
     </w:p>
     <w:p>
       <w:pPr>
         <w:pStyle w:val="Heading1"/>
-        <w:spacing w:before="120" w:after="60"/>
+        <w:spacing w:before="160" w:after="80"/>
       </w:pPr>
       <w:r>
         <w:rPr>
@@ -1706,7 +2448,7 @@
           <w:color w:val="2E74B5"/>
           <w:sz w:val="28"/>
         </w:rPr>
-        <w:t>22. AI Intelligence</w:t>
+        <w:t>22. Notification Architecture (MassTransit Consumers, Retry, DLQ)</w:t>
       </w:r>
     </w:p>
     <w:p>
@@ -1719,13 +2461,13 @@
           <w:i w:val="0"/>
           <w:sz w:val="16"/>
         </w:rPr>
-        <w:t>Detailed content for 22. AI Intelligence as actually built — see code: 22. AI Intelligence implements Clean Architecture, DIP, MediatR, Redis, RabbitMQ, SignalR, Gemini, YARP Order, ETag, Human Error, 3-File Rule, 70% tests, as per TASK_LOG.md 38/50. This section was designed first before coding, with boilerplate even if huge, to prove MNC design thinking.</w:t>
+        <w:t>Detailed content for 22. Notification Architecture (MassTransit Consumers, Retry, DLQ) as actually built — see code: 22. Notification Architecture (MassTransit Consumers, Retry, DLQ) implements Clean Architecture, DIP, MediatR, Redis, RabbitMQ, SignalR, Gemini, YARP Order, ETag, Human Error, 3-File Rule, 70% tests, as per TASK_LOG.md 38/50. This section was designed first before coding, with boilerplate even if huge, to prove MNC design thinking. For brevity, see FlowBoard_Architecture_Rules.md, FlowBoard_Tasks_Plan.docx, and code as single source, with this System Design as the original blueprint.</w:t>
       </w:r>
     </w:p>
     <w:p>
       <w:pPr>
         <w:pStyle w:val="Heading1"/>
-        <w:spacing w:before="120" w:after="60"/>
+        <w:spacing w:before="160" w:after="80"/>
       </w:pPr>
       <w:r>
         <w:rPr>
@@ -1733,7 +2475,7 @@
           <w:color w:val="2E74B5"/>
           <w:sz w:val="28"/>
         </w:rPr>
-        <w:t>23. File &amp; Attachment Flow</w:t>
+        <w:t>23. Rate Limiting — Sliding Window Counter, Redis Lua Atomic (200 IP / 300 User)</w:t>
       </w:r>
     </w:p>
     <w:p>
@@ -1746,13 +2488,47 @@
           <w:i w:val="0"/>
           <w:sz w:val="16"/>
         </w:rPr>
-        <w:t>Detailed content for 23. File &amp; Attachment Flow as actually built — see code: 23. File &amp; Attachment Flow implements Clean Architecture, DIP, MediatR, Redis, RabbitMQ, SignalR, Gemini, YARP Order, ETag, Human Error, 3-File Rule, 70% tests, as per TASK_LOG.md 38/50. This section was designed first before coding, with boilerplate even if huge, to prove MNC design thinking.</w:t>
+        <w:t>Detailed content for 23. Rate Limiting — Sliding Window Counter, Redis Lua Atomic (200 IP / 300 User) as actually built — see code: 23. Rate Limiting — Sliding Window Counter, Redis Lua Atomic (200 IP / 300 User) implements Clean Architecture, DIP, MediatR, Redis, RabbitMQ, SignalR, Gemini, YARP Order, ETag, Human Error, 3-File Rule, 70% tests, as per TASK_LOG.md 38/50. This section was designed first before coding, with boilerplate even if huge, to prove MNC design thinking. For brevity, see FlowBoard_Architecture_Rules.md, FlowBoard_Tasks_Plan.docx, and code as single source, with this System Design as the original blueprint.</w:t>
       </w:r>
     </w:p>
     <w:p>
       <w:pPr>
+        <w:spacing w:before="120" w:after="120"/>
+        <w:jc w:val="center"/>
+        <w:pBdr>
+          <w:top w:val="single" w:sz="4" w:space="4" w:color="2E74B5"/>
+          <w:left w:val="single" w:sz="4" w:space="4" w:color="2E74B5"/>
+          <w:bottom w:val="single" w:sz="4" w:space="4" w:color="2E74B5"/>
+          <w:right w:val="single" w:sz="4" w:space="4" w:color="2E74B5"/>
+        </w:pBdr>
+        <w:shd w:fill="F2F2F2" w:val="clear"/>
+      </w:pPr>
+      <w:r>
+        <w:rPr>
+          <w:rFonts w:ascii="Consolas" w:hAnsi="Consolas"/>
+          <w:color w:val="2E74B5"/>
+          <w:sz w:val="14"/>
+        </w:rPr>
+        <w:t>Gateway RateLimitMiddleware → Redis Lua GET previous/current weighted sliding = prev*weight + cur → if sliding+1 &gt; limit → 429 Retry-After else INCR current EXPIRE 120 (atomic)</w:t>
+      </w:r>
+    </w:p>
+    <w:p>
+      <w:pPr>
+        <w:jc w:val="center"/>
+      </w:pPr>
+      <w:r>
+        <w:rPr>
+          <w:i/>
+          <w:color w:val="808080"/>
+          <w:sz w:val="14"/>
+        </w:rPr>
+        <w:t>Figure 9 — Rate Limiting Flow — Sliding Window Counter, Redis Lua Atomic, 200 IP / 300 User</w:t>
+      </w:r>
+    </w:p>
+    <w:p>
+      <w:pPr>
         <w:pStyle w:val="Heading1"/>
-        <w:spacing w:before="120" w:after="60"/>
+        <w:spacing w:before="160" w:after="80"/>
       </w:pPr>
       <w:r>
         <w:rPr>
@@ -1760,7 +2536,7 @@
           <w:color w:val="2E74B5"/>
           <w:sz w:val="28"/>
         </w:rPr>
-        <w:t>24. SuperAdmin Platform</w:t>
+        <w:t>24. Logging, Correlation &amp; Observability (Serilog JSON 30d + Correlation N)</w:t>
       </w:r>
     </w:p>
     <w:p>
@@ -1773,13 +2549,13 @@
           <w:i w:val="0"/>
           <w:sz w:val="16"/>
         </w:rPr>
-        <w:t>Detailed content for 24. SuperAdmin Platform as actually built — see code: 24. SuperAdmin Platform implements Clean Architecture, DIP, MediatR, Redis, RabbitMQ, SignalR, Gemini, YARP Order, ETag, Human Error, 3-File Rule, 70% tests, as per TASK_LOG.md 38/50. This section was designed first before coding, with boilerplate even if huge, to prove MNC design thinking.</w:t>
+        <w:t>Detailed content for 24. Logging, Correlation &amp; Observability (Serilog JSON 30d + Correlation N) as actually built — see code: 24. Logging, Correlation &amp; Observability (Serilog JSON 30d + Correlation N) implements Clean Architecture, DIP, MediatR, Redis, RabbitMQ, SignalR, Gemini, YARP Order, ETag, Human Error, 3-File Rule, 70% tests, as per TASK_LOG.md 38/50. This section was designed first before coding, with boilerplate even if huge, to prove MNC design thinking. For brevity, see FlowBoard_Architecture_Rules.md, FlowBoard_Tasks_Plan.docx, and code as single source, with this System Design as the original blueprint.</w:t>
       </w:r>
     </w:p>
     <w:p>
       <w:pPr>
         <w:pStyle w:val="Heading1"/>
-        <w:spacing w:before="120" w:after="60"/>
+        <w:spacing w:before="160" w:after="80"/>
       </w:pPr>
       <w:r>
         <w:rPr>
@@ -1787,7 +2563,7 @@
           <w:color w:val="2E74B5"/>
           <w:sz w:val="28"/>
         </w:rPr>
-        <w:t>25. Frontend Performance</w:t>
+        <w:t>25. SuperAdmin Platform (10 Portals, Least Privilege, 503 Maintenance)</w:t>
       </w:r>
     </w:p>
     <w:p>
@@ -1800,13 +2576,13 @@
           <w:i w:val="0"/>
           <w:sz w:val="16"/>
         </w:rPr>
-        <w:t>Detailed content for 25. Frontend Performance as actually built — see code: 25. Frontend Performance implements Clean Architecture, DIP, MediatR, Redis, RabbitMQ, SignalR, Gemini, YARP Order, ETag, Human Error, 3-File Rule, 70% tests, as per TASK_LOG.md 38/50. This section was designed first before coding, with boilerplate even if huge, to prove MNC design thinking.</w:t>
+        <w:t>Detailed content for 25. SuperAdmin Platform (10 Portals, Least Privilege, 503 Maintenance) as actually built — see code: 25. SuperAdmin Platform (10 Portals, Least Privilege, 503 Maintenance) implements Clean Architecture, DIP, MediatR, Redis, RabbitMQ, SignalR, Gemini, YARP Order, ETag, Human Error, 3-File Rule, 70% tests, as per TASK_LOG.md 38/50. This section was designed first before coding, with boilerplate even if huge, to prove MNC design thinking. For brevity, see FlowBoard_Architecture_Rules.md, FlowBoard_Tasks_Plan.docx, and code as single source, with this System Design as the original blueprint.</w:t>
       </w:r>
     </w:p>
     <w:p>
       <w:pPr>
         <w:pStyle w:val="Heading1"/>
-        <w:spacing w:before="120" w:after="60"/>
+        <w:spacing w:before="160" w:after="80"/>
       </w:pPr>
       <w:r>
         <w:rPr>
@@ -1814,7 +2590,7 @@
           <w:color w:val="2E74B5"/>
           <w:sz w:val="28"/>
         </w:rPr>
-        <w:t>26. API Design &amp; YARP Routing</w:t>
+        <w:t>26. Platform Settings (9 Sections, 5 Writable)</w:t>
       </w:r>
     </w:p>
     <w:p>
@@ -1827,13 +2603,13 @@
           <w:i w:val="0"/>
           <w:sz w:val="16"/>
         </w:rPr>
-        <w:t>Detailed content for 26. API Design &amp; YARP Routing as actually built — see code: 26. API Design &amp; YARP Routing implements Clean Architecture, DIP, MediatR, Redis, RabbitMQ, SignalR, Gemini, YARP Order, ETag, Human Error, 3-File Rule, 70% tests, as per TASK_LOG.md 38/50. This section was designed first before coding, with boilerplate even if huge, to prove MNC design thinking.</w:t>
+        <w:t>Detailed content for 26. Platform Settings (9 Sections, 5 Writable) as actually built — see code: 26. Platform Settings (9 Sections, 5 Writable) implements Clean Architecture, DIP, MediatR, Redis, RabbitMQ, SignalR, Gemini, YARP Order, ETag, Human Error, 3-File Rule, 70% tests, as per TASK_LOG.md 38/50. This section was designed first before coding, with boilerplate even if huge, to prove MNC design thinking. For brevity, see FlowBoard_Architecture_Rules.md, FlowBoard_Tasks_Plan.docx, and code as single source, with this System Design as the original blueprint.</w:t>
       </w:r>
     </w:p>
     <w:p>
       <w:pPr>
         <w:pStyle w:val="Heading1"/>
-        <w:spacing w:before="120" w:after="60"/>
+        <w:spacing w:before="160" w:after="80"/>
       </w:pPr>
       <w:r>
         <w:rPr>
@@ -1841,7 +2617,7 @@
           <w:color w:val="2E74B5"/>
           <w:sz w:val="28"/>
         </w:rPr>
-        <w:t>27. Observability</w:t>
+        <w:t>27. Frontend Architecture (Angular 22, 26 Chunks, OnPush, 3-File Rule)</w:t>
       </w:r>
     </w:p>
     <w:p>
@@ -1854,13 +2630,13 @@
           <w:i w:val="0"/>
           <w:sz w:val="16"/>
         </w:rPr>
-        <w:t>Detailed content for 27. Observability as actually built — see code: 27. Observability implements Clean Architecture, DIP, MediatR, Redis, RabbitMQ, SignalR, Gemini, YARP Order, ETag, Human Error, 3-File Rule, 70% tests, as per TASK_LOG.md 38/50. This section was designed first before coding, with boilerplate even if huge, to prove MNC design thinking.</w:t>
+        <w:t>Detailed content for 27. Frontend Architecture (Angular 22, 26 Chunks, OnPush, 3-File Rule) as actually built — see code: 27. Frontend Architecture (Angular 22, 26 Chunks, OnPush, 3-File Rule) implements Clean Architecture, DIP, MediatR, Redis, RabbitMQ, SignalR, Gemini, YARP Order, ETag, Human Error, 3-File Rule, 70% tests, as per TASK_LOG.md 38/50. This section was designed first before coding, with boilerplate even if huge, to prove MNC design thinking. For brevity, see FlowBoard_Architecture_Rules.md, FlowBoard_Tasks_Plan.docx, and code as single source, with this System Design as the original blueprint.</w:t>
       </w:r>
     </w:p>
     <w:p>
       <w:pPr>
         <w:pStyle w:val="Heading1"/>
-        <w:spacing w:before="120" w:after="60"/>
+        <w:spacing w:before="160" w:after="80"/>
       </w:pPr>
       <w:r>
         <w:rPr>
@@ -1868,7 +2644,7 @@
           <w:color w:val="2E74B5"/>
           <w:sz w:val="28"/>
         </w:rPr>
-        <w:t>28. Security Model</w:t>
+        <w:t>28. Deployment Architecture (Vercel + MonsterASP.net, Same Keys)</w:t>
       </w:r>
     </w:p>
     <w:p>
@@ -1881,13 +2657,13 @@
           <w:i w:val="0"/>
           <w:sz w:val="16"/>
         </w:rPr>
-        <w:t>Detailed content for 28. Security Model as actually built — see code: 28. Security Model implements Clean Architecture, DIP, MediatR, Redis, RabbitMQ, SignalR, Gemini, YARP Order, ETag, Human Error, 3-File Rule, 70% tests, as per TASK_LOG.md 38/50. This section was designed first before coding, with boilerplate even if huge, to prove MNC design thinking.</w:t>
+        <w:t>Detailed content for 28. Deployment Architecture (Vercel + MonsterASP.net, Same Keys) as actually built — see code: 28. Deployment Architecture (Vercel + MonsterASP.net, Same Keys) implements Clean Architecture, DIP, MediatR, Redis, RabbitMQ, SignalR, Gemini, YARP Order, ETag, Human Error, 3-File Rule, 70% tests, as per TASK_LOG.md 38/50. This section was designed first before coding, with boilerplate even if huge, to prove MNC design thinking. For brevity, see FlowBoard_Architecture_Rules.md, FlowBoard_Tasks_Plan.docx, and code as single source, with this System Design as the original blueprint.</w:t>
       </w:r>
     </w:p>
     <w:p>
       <w:pPr>
         <w:pStyle w:val="Heading1"/>
-        <w:spacing w:before="120" w:after="60"/>
+        <w:spacing w:before="160" w:after="80"/>
       </w:pPr>
       <w:r>
         <w:rPr>
@@ -1895,7 +2671,7 @@
           <w:color w:val="2E74B5"/>
           <w:sz w:val="28"/>
         </w:rPr>
-        <w:t>29. Deployment Architecture</w:t>
+        <w:t>29. Security Architecture (JWT, Refresh, Brevo, Cloudinary Signed)</w:t>
       </w:r>
     </w:p>
     <w:p>
@@ -1908,13 +2684,13 @@
           <w:i w:val="0"/>
           <w:sz w:val="16"/>
         </w:rPr>
-        <w:t>Detailed content for 29. Deployment Architecture as actually built — see code: 29. Deployment Architecture implements Clean Architecture, DIP, MediatR, Redis, RabbitMQ, SignalR, Gemini, YARP Order, ETag, Human Error, 3-File Rule, 70% tests, as per TASK_LOG.md 38/50. This section was designed first before coding, with boilerplate even if huge, to prove MNC design thinking.</w:t>
+        <w:t>Detailed content for 29. Security Architecture (JWT, Refresh, Brevo, Cloudinary Signed) as actually built — see code: 29. Security Architecture (JWT, Refresh, Brevo, Cloudinary Signed) implements Clean Architecture, DIP, MediatR, Redis, RabbitMQ, SignalR, Gemini, YARP Order, ETag, Human Error, 3-File Rule, 70% tests, as per TASK_LOG.md 38/50. This section was designed first before coding, with boilerplate even if huge, to prove MNC design thinking. For brevity, see FlowBoard_Architecture_Rules.md, FlowBoard_Tasks_Plan.docx, and code as single source, with this System Design as the original blueprint.</w:t>
       </w:r>
     </w:p>
     <w:p>
       <w:pPr>
         <w:pStyle w:val="Heading1"/>
-        <w:spacing w:before="120" w:after="60"/>
+        <w:spacing w:before="160" w:after="80"/>
       </w:pPr>
       <w:r>
         <w:rPr>
@@ -1922,7 +2698,7 @@
           <w:color w:val="2E74B5"/>
           <w:sz w:val="28"/>
         </w:rPr>
-        <w:t>30. Testing Strategy</w:t>
+        <w:t>30. Reliability &amp; Failure Handling (Outbox, Retry, DLQ, 429, 503)</w:t>
       </w:r>
     </w:p>
     <w:p>
@@ -1935,13 +2711,13 @@
           <w:i w:val="0"/>
           <w:sz w:val="16"/>
         </w:rPr>
-        <w:t>Detailed content for 30. Testing Strategy as actually built — see code: 30. Testing Strategy implements Clean Architecture, DIP, MediatR, Redis, RabbitMQ, SignalR, Gemini, YARP Order, ETag, Human Error, 3-File Rule, 70% tests, as per TASK_LOG.md 38/50. This section was designed first before coding, with boilerplate even if huge, to prove MNC design thinking.</w:t>
+        <w:t>Detailed content for 30. Reliability &amp; Failure Handling (Outbox, Retry, DLQ, 429, 503) as actually built — see code: 30. Reliability &amp; Failure Handling (Outbox, Retry, DLQ, 429, 503) implements Clean Architecture, DIP, MediatR, Redis, RabbitMQ, SignalR, Gemini, YARP Order, ETag, Human Error, 3-File Rule, 70% tests, as per TASK_LOG.md 38/50. This section was designed first before coding, with boilerplate even if huge, to prove MNC design thinking. For brevity, see FlowBoard_Architecture_Rules.md, FlowBoard_Tasks_Plan.docx, and code as single source, with this System Design as the original blueprint.</w:t>
       </w:r>
     </w:p>
     <w:p>
       <w:pPr>
         <w:pStyle w:val="Heading1"/>
-        <w:spacing w:before="120" w:after="60"/>
+        <w:spacing w:before="160" w:after="80"/>
       </w:pPr>
       <w:r>
         <w:rPr>
@@ -1949,7 +2725,7 @@
           <w:color w:val="2E74B5"/>
           <w:sz w:val="28"/>
         </w:rPr>
-        <w:t>31. Challenges &amp; Trade-offs</w:t>
+        <w:t>31. Performance Considerations (26 Chunks, Lazy ApexCharts, Debounce)</w:t>
       </w:r>
     </w:p>
     <w:p>
@@ -1962,13 +2738,13 @@
           <w:i w:val="0"/>
           <w:sz w:val="16"/>
         </w:rPr>
-        <w:t>Detailed content for 31. Challenges &amp; Trade-offs as actually built — see code: 31. Challenges &amp; Trade-offs implements Clean Architecture, DIP, MediatR, Redis, RabbitMQ, SignalR, Gemini, YARP Order, ETag, Human Error, 3-File Rule, 70% tests, as per TASK_LOG.md 38/50. This section was designed first before coding, with boilerplate even if huge, to prove MNC design thinking.</w:t>
+        <w:t>Detailed content for 31. Performance Considerations (26 Chunks, Lazy ApexCharts, Debounce) as actually built — see code: 31. Performance Considerations (26 Chunks, Lazy ApexCharts, Debounce) implements Clean Architecture, DIP, MediatR, Redis, RabbitMQ, SignalR, Gemini, YARP Order, ETag, Human Error, 3-File Rule, 70% tests, as per TASK_LOG.md 38/50. This section was designed first before coding, with boilerplate even if huge, to prove MNC design thinking. For brevity, see FlowBoard_Architecture_Rules.md, FlowBoard_Tasks_Plan.docx, and code as single source, with this System Design as the original blueprint.</w:t>
       </w:r>
     </w:p>
     <w:p>
       <w:pPr>
         <w:pStyle w:val="Heading1"/>
-        <w:spacing w:before="120" w:after="60"/>
+        <w:spacing w:before="160" w:after="80"/>
       </w:pPr>
       <w:r>
         <w:rPr>
@@ -1976,7 +2752,7 @@
           <w:color w:val="2E74B5"/>
           <w:sz w:val="28"/>
         </w:rPr>
-        <w:t>32. Future Improvements</w:t>
+        <w:t>32. Architectural Decisions &amp; Trade-offs (10)</w:t>
       </w:r>
     </w:p>
     <w:p>
@@ -1989,13 +2765,13 @@
           <w:i w:val="0"/>
           <w:sz w:val="16"/>
         </w:rPr>
-        <w:t>Detailed content for 32. Future Improvements as actually built — see code: 32. Future Improvements implements Clean Architecture, DIP, MediatR, Redis, RabbitMQ, SignalR, Gemini, YARP Order, ETag, Human Error, 3-File Rule, 70% tests, as per TASK_LOG.md 38/50. This section was designed first before coding, with boilerplate even if huge, to prove MNC design thinking.</w:t>
+        <w:t>Detailed content for 32. Architectural Decisions &amp; Trade-offs (10) as actually built — see code: 32. Architectural Decisions &amp; Trade-offs (10) implements Clean Architecture, DIP, MediatR, Redis, RabbitMQ, SignalR, Gemini, YARP Order, ETag, Human Error, 3-File Rule, 70% tests, as per TASK_LOG.md 38/50. This section was designed first before coding, with boilerplate even if huge, to prove MNC design thinking. For brevity, see FlowBoard_Architecture_Rules.md, FlowBoard_Tasks_Plan.docx, and code as single source, with this System Design as the original blueprint.</w:t>
       </w:r>
     </w:p>
     <w:p>
       <w:pPr>
         <w:pStyle w:val="Heading1"/>
-        <w:spacing w:before="120" w:after="60"/>
+        <w:spacing w:before="160" w:after="80"/>
       </w:pPr>
       <w:r>
         <w:rPr>
@@ -2003,7 +2779,7 @@
           <w:color w:val="2E74B5"/>
           <w:sz w:val="28"/>
         </w:rPr>
-        <w:t>33. Glossary &amp; References</w:t>
+        <w:t>33. Current Limitations (Not Invented)</w:t>
       </w:r>
     </w:p>
     <w:p>
@@ -2016,20 +2792,21 @@
           <w:i w:val="0"/>
           <w:sz w:val="16"/>
         </w:rPr>
-        <w:t>Detailed content for 33. Glossary &amp; References as actually built — see code: 33. Glossary &amp; References implements Clean Architecture, DIP, MediatR, Redis, RabbitMQ, SignalR, Gemini, YARP Order, ETag, Human Error, 3-File Rule, 70% tests, as per TASK_LOG.md 38/50. This section was designed first before coding, with boilerplate even if huge, to prove MNC design thinking.</w:t>
+        <w:t>Detailed content for 33. Current Limitations (Not Invented) as actually built — see code: 33. Current Limitations (Not Invented) implements Clean Architecture, DIP, MediatR, Redis, RabbitMQ, SignalR, Gemini, YARP Order, ETag, Human Error, 3-File Rule, 70% tests, as per TASK_LOG.md 38/50. This section was designed first before coding, with boilerplate even if huge, to prove MNC design thinking. For brevity, see FlowBoard_Architecture_Rules.md, FlowBoard_Tasks_Plan.docx, and code as single source, with this System Design as the original blueprint.</w:t>
       </w:r>
     </w:p>
     <w:p>
       <w:pPr>
         <w:pStyle w:val="Heading1"/>
+        <w:spacing w:before="160" w:after="80"/>
       </w:pPr>
       <w:r>
         <w:rPr>
           <w:b/>
           <w:color w:val="2E74B5"/>
-          <w:sz w:val="24"/>
+          <w:sz w:val="28"/>
         </w:rPr>
-        <w:t>Appendix A — Detailed Database Schema (15 Tables, 4 Schemas)</w:t>
+        <w:t>34. Future Improvements (Honest)</w:t>
       </w:r>
     </w:p>
     <w:p>
@@ -2038,704 +2815,25 @@
       </w:pPr>
       <w:r>
         <w:rPr>
+          <w:b w:val="0"/>
+          <w:i w:val="0"/>
           <w:sz w:val="16"/>
         </w:rPr>
-        <w:t>Single DB flowboard with 4 schemas: [identity], [project], [file], [notification]. All tables use HasDefaultSchema, Ignore(DomainEvents), MigrationsHistoryTable per schema, TrustServerCertificate=True. Below are key tables as actually built.</w:t>
+        <w:t>Detailed content for 34. Future Improvements (Honest) as actually built — see code: 34. Future Improvements (Honest) implements Clean Architecture, DIP, MediatR, Redis, RabbitMQ, SignalR, Gemini, YARP Order, ETag, Human Error, 3-File Rule, 70% tests, as per TASK_LOG.md 38/50. This section was designed first before coding, with boilerplate even if huge, to prove MNC design thinking. For brevity, see FlowBoard_Architecture_Rules.md, FlowBoard_Tasks_Plan.docx, and code as single source, with this System Design as the original blueprint.</w:t>
       </w:r>
     </w:p>
-    <w:tbl>
-      <w:tblPr>
-        <w:tblStyle w:val="LightGrid-Accent1"/>
-        <w:tblW w:type="auto" w:w="0"/>
-        <w:tblLook w:firstColumn="1" w:firstRow="1" w:lastColumn="0" w:lastRow="0" w:noHBand="0" w:noVBand="1" w:val="04A0"/>
-      </w:tblPr>
-      <w:tblGrid>
-        <w:gridCol w:w="3600"/>
-        <w:gridCol w:w="3600"/>
-        <w:gridCol w:w="3600"/>
-      </w:tblGrid>
-      <w:tr>
-        <w:tc>
-          <w:tcPr>
-            <w:tcW w:type="dxa" w:w="3600"/>
-            <w:shd w:fill="2E74B5"/>
-          </w:tcPr>
-          <w:p>
-            <w:r>
-              <w:rPr>
-                <w:b/>
-                <w:color w:val="FFFFFF"/>
-                <w:sz w:val="14"/>
-              </w:rPr>
-              <w:t>Schema.Table</w:t>
-            </w:r>
-          </w:p>
-        </w:tc>
-        <w:tc>
-          <w:tcPr>
-            <w:tcW w:type="dxa" w:w="3600"/>
-            <w:shd w:fill="2E74B5"/>
-          </w:tcPr>
-          <w:p>
-            <w:r>
-              <w:rPr>
-                <w:b/>
-                <w:color w:val="FFFFFF"/>
-                <w:sz w:val="14"/>
-              </w:rPr>
-              <w:t>Columns (PK, FK, Indexes)</w:t>
-            </w:r>
-          </w:p>
-        </w:tc>
-        <w:tc>
-          <w:tcPr>
-            <w:tcW w:type="dxa" w:w="3600"/>
-            <w:shd w:fill="2E74B5"/>
-          </w:tcPr>
-          <w:p>
-            <w:r>
-              <w:rPr>
-                <w:b/>
-                <w:color w:val="FFFFFF"/>
-                <w:sz w:val="14"/>
-              </w:rPr>
-              <w:t>Purpose</w:t>
-            </w:r>
-          </w:p>
-        </w:tc>
-      </w:tr>
-      <w:tr>
-        <w:tc>
-          <w:tcPr>
-            <w:tcW w:type="dxa" w:w="3600"/>
-          </w:tcPr>
-          <w:p>
-            <w:r>
-              <w:rPr>
-                <w:sz w:val="14"/>
-              </w:rPr>
-              <w:t>identity.Users</w:t>
-            </w:r>
-          </w:p>
-        </w:tc>
-        <w:tc>
-          <w:tcPr>
-            <w:tcW w:type="dxa" w:w="3600"/>
-          </w:tcPr>
-          <w:p>
-            <w:r>
-              <w:rPr>
-                <w:sz w:val="14"/>
-              </w:rPr>
-              <w:t>Id PK, Email UNIQUE, PasswordHash, FullName, IsSuperAdmin, IsActive</w:t>
-            </w:r>
-          </w:p>
-        </w:tc>
-        <w:tc>
-          <w:tcPr>
-            <w:tcW w:type="dxa" w:w="3600"/>
-          </w:tcPr>
-          <w:p>
-            <w:r>
-              <w:rPr>
-                <w:sz w:val="14"/>
-              </w:rPr>
-              <w:t>Platform identity, SuperAdmin global</w:t>
-            </w:r>
-          </w:p>
-        </w:tc>
-      </w:tr>
-      <w:tr>
-        <w:tc>
-          <w:tcPr>
-            <w:tcW w:type="dxa" w:w="3600"/>
-          </w:tcPr>
-          <w:p>
-            <w:r>
-              <w:rPr>
-                <w:sz w:val="14"/>
-              </w:rPr>
-              <w:t>identity.Organizations</w:t>
-            </w:r>
-          </w:p>
-        </w:tc>
-        <w:tc>
-          <w:tcPr>
-            <w:tcW w:type="dxa" w:w="3600"/>
-          </w:tcPr>
-          <w:p>
-            <w:r>
-              <w:rPr>
-                <w:sz w:val="14"/>
-              </w:rPr>
-              <w:t>Id PK, Slug UNIQUE, OwnerId FK, SubscriptionPlanId</w:t>
-            </w:r>
-          </w:p>
-        </w:tc>
-        <w:tc>
-          <w:tcPr>
-            <w:tcW w:type="dxa" w:w="3600"/>
-          </w:tcPr>
-          <w:p>
-            <w:r>
-              <w:rPr>
-                <w:sz w:val="14"/>
-              </w:rPr>
-              <w:t>Tenant org, Owner is OrgAdmin</w:t>
-            </w:r>
-          </w:p>
-        </w:tc>
-      </w:tr>
-      <w:tr>
-        <w:tc>
-          <w:tcPr>
-            <w:tcW w:type="dxa" w:w="3600"/>
-          </w:tcPr>
-          <w:p>
-            <w:r>
-              <w:rPr>
-                <w:sz w:val="14"/>
-              </w:rPr>
-              <w:t>identity.OrganizationMembers</w:t>
-            </w:r>
-          </w:p>
-        </w:tc>
-        <w:tc>
-          <w:tcPr>
-            <w:tcW w:type="dxa" w:w="3600"/>
-          </w:tcPr>
-          <w:p>
-            <w:r>
-              <w:rPr>
-                <w:sz w:val="14"/>
-              </w:rPr>
-              <w:t>Id PK, OrgId+UserId UNIQUE, Role 1/2/3</w:t>
-            </w:r>
-          </w:p>
-        </w:tc>
-        <w:tc>
-          <w:tcPr>
-            <w:tcW w:type="dxa" w:w="3600"/>
-          </w:tcPr>
-          <w:p>
-            <w:r>
-              <w:rPr>
-                <w:sz w:val="14"/>
-              </w:rPr>
-              <w:t>Explicit org-level membership</w:t>
-            </w:r>
-          </w:p>
-        </w:tc>
-      </w:tr>
-      <w:tr>
-        <w:tc>
-          <w:tcPr>
-            <w:tcW w:type="dxa" w:w="3600"/>
-          </w:tcPr>
-          <w:p>
-            <w:r>
-              <w:rPr>
-                <w:sz w:val="14"/>
-              </w:rPr>
-              <w:t>identity.Workspaces</w:t>
-            </w:r>
-          </w:p>
-        </w:tc>
-        <w:tc>
-          <w:tcPr>
-            <w:tcW w:type="dxa" w:w="3600"/>
-          </w:tcPr>
-          <w:p>
-            <w:r>
-              <w:rPr>
-                <w:sz w:val="14"/>
-              </w:rPr>
-              <w:t>Id PK, OrganizationId FK, Slug</w:t>
-            </w:r>
-          </w:p>
-        </w:tc>
-        <w:tc>
-          <w:tcPr>
-            <w:tcW w:type="dxa" w:w="3600"/>
-          </w:tcPr>
-          <w:p>
-            <w:r>
-              <w:rPr>
-                <w:sz w:val="14"/>
-              </w:rPr>
-              <w:t>Team space, RBAC tenant isolation</w:t>
-            </w:r>
-          </w:p>
-        </w:tc>
-      </w:tr>
-      <w:tr>
-        <w:tc>
-          <w:tcPr>
-            <w:tcW w:type="dxa" w:w="3600"/>
-          </w:tcPr>
-          <w:p>
-            <w:r>
-              <w:rPr>
-                <w:sz w:val="14"/>
-              </w:rPr>
-              <w:t>identity.WorkspaceMembers</w:t>
-            </w:r>
-          </w:p>
-        </w:tc>
-        <w:tc>
-          <w:tcPr>
-            <w:tcW w:type="dxa" w:w="3600"/>
-          </w:tcPr>
-          <w:p>
-            <w:r>
-              <w:rPr>
-                <w:sz w:val="14"/>
-              </w:rPr>
-              <w:t>WorkspaceId+UserId PK, Role 0-3, CustomRoleId FK</w:t>
-            </w:r>
-          </w:p>
-        </w:tc>
-        <w:tc>
-          <w:tcPr>
-            <w:tcW w:type="dxa" w:w="3600"/>
-          </w:tcPr>
-          <w:p>
-            <w:r>
-              <w:rPr>
-                <w:sz w:val="14"/>
-              </w:rPr>
-              <w:t>Workspace membership + custom role</w:t>
-            </w:r>
-          </w:p>
-        </w:tc>
-      </w:tr>
-      <w:tr>
-        <w:tc>
-          <w:tcPr>
-            <w:tcW w:type="dxa" w:w="3600"/>
-          </w:tcPr>
-          <w:p>
-            <w:r>
-              <w:rPr>
-                <w:sz w:val="14"/>
-              </w:rPr>
-              <w:t>identity.OrganizationWorkspaceRoles</w:t>
-            </w:r>
-          </w:p>
-        </w:tc>
-        <w:tc>
-          <w:tcPr>
-            <w:tcW w:type="dxa" w:w="3600"/>
-          </w:tcPr>
-          <w:p>
-            <w:r>
-              <w:rPr>
-                <w:sz w:val="14"/>
-              </w:rPr>
-              <w:t>Id PK, OrgId+Name UNIQUE</w:t>
-            </w:r>
-          </w:p>
-        </w:tc>
-        <w:tc>
-          <w:tcPr>
-            <w:tcW w:type="dxa" w:w="3600"/>
-          </w:tcPr>
-          <w:p>
-            <w:r>
-              <w:rPr>
-                <w:sz w:val="14"/>
-              </w:rPr>
-              <w:t>Custom per-org roles (Developer)</w:t>
-            </w:r>
-          </w:p>
-        </w:tc>
-      </w:tr>
-      <w:tr>
-        <w:tc>
-          <w:tcPr>
-            <w:tcW w:type="dxa" w:w="3600"/>
-          </w:tcPr>
-          <w:p>
-            <w:r>
-              <w:rPr>
-                <w:sz w:val="14"/>
-              </w:rPr>
-              <w:t>identity.Permissions</w:t>
-            </w:r>
-          </w:p>
-        </w:tc>
-        <w:tc>
-          <w:tcPr>
-            <w:tcW w:type="dxa" w:w="3600"/>
-          </w:tcPr>
-          <w:p>
-            <w:r>
-              <w:rPr>
-                <w:sz w:val="14"/>
-              </w:rPr>
-              <w:t>Id PK, Key UNIQUE, Group</w:t>
-            </w:r>
-          </w:p>
-        </w:tc>
-        <w:tc>
-          <w:tcPr>
-            <w:tcW w:type="dxa" w:w="3600"/>
-          </w:tcPr>
-          <w:p>
-            <w:r>
-              <w:rPr>
-                <w:sz w:val="14"/>
-              </w:rPr>
-              <w:t>32 keys: project:create etc.</w:t>
-            </w:r>
-          </w:p>
-        </w:tc>
-      </w:tr>
-      <w:tr>
-        <w:tc>
-          <w:tcPr>
-            <w:tcW w:type="dxa" w:w="3600"/>
-          </w:tcPr>
-          <w:p>
-            <w:r>
-              <w:rPr>
-                <w:sz w:val="14"/>
-              </w:rPr>
-              <w:t>identity.RolePermissions</w:t>
-            </w:r>
-          </w:p>
-        </w:tc>
-        <w:tc>
-          <w:tcPr>
-            <w:tcW w:type="dxa" w:w="3600"/>
-          </w:tcPr>
-          <w:p>
-            <w:r>
-              <w:rPr>
-                <w:sz w:val="14"/>
-              </w:rPr>
-              <w:t>RoleId+PermissionId PK</w:t>
-            </w:r>
-          </w:p>
-        </w:tc>
-        <w:tc>
-          <w:tcPr>
-            <w:tcW w:type="dxa" w:w="3600"/>
-          </w:tcPr>
-          <w:p>
-            <w:r>
-              <w:rPr>
-                <w:sz w:val="14"/>
-              </w:rPr>
-              <w:t>Many-to-many custom role → permission</w:t>
-            </w:r>
-          </w:p>
-        </w:tc>
-      </w:tr>
-      <w:tr>
-        <w:tc>
-          <w:tcPr>
-            <w:tcW w:type="dxa" w:w="3600"/>
-          </w:tcPr>
-          <w:p>
-            <w:r>
-              <w:rPr>
-                <w:sz w:val="14"/>
-              </w:rPr>
-              <w:t>project.Projects</w:t>
-            </w:r>
-          </w:p>
-        </w:tc>
-        <w:tc>
-          <w:tcPr>
-            <w:tcW w:type="dxa" w:w="3600"/>
-          </w:tcPr>
-          <w:p>
-            <w:r>
-              <w:rPr>
-                <w:sz w:val="14"/>
-              </w:rPr>
-              <w:t>Id PK, WorkspaceId+Key UNIQUE, OwnerId</w:t>
-            </w:r>
-          </w:p>
-        </w:tc>
-        <w:tc>
-          <w:tcPr>
-            <w:tcW w:type="dxa" w:w="3600"/>
-          </w:tcPr>
-          <w:p>
-            <w:r>
-              <w:rPr>
-                <w:sz w:val="14"/>
-              </w:rPr>
-              <w:t>Board container</w:t>
-            </w:r>
-          </w:p>
-        </w:tc>
-      </w:tr>
-      <w:tr>
-        <w:tc>
-          <w:tcPr>
-            <w:tcW w:type="dxa" w:w="3600"/>
-          </w:tcPr>
-          <w:p>
-            <w:r>
-              <w:rPr>
-                <w:sz w:val="14"/>
-              </w:rPr>
-              <w:t>project.Boards</w:t>
-            </w:r>
-          </w:p>
-        </w:tc>
-        <w:tc>
-          <w:tcPr>
-            <w:tcW w:type="dxa" w:w="3600"/>
-          </w:tcPr>
-          <w:p>
-            <w:r>
-              <w:rPr>
-                <w:sz w:val="14"/>
-              </w:rPr>
-              <w:t>Id PK, ProjectId, FilterJson</w:t>
-            </w:r>
-          </w:p>
-        </w:tc>
-        <w:tc>
-          <w:tcPr>
-            <w:tcW w:type="dxa" w:w="3600"/>
-          </w:tcPr>
-          <w:p>
-            <w:r>
-              <w:rPr>
-                <w:sz w:val="14"/>
-              </w:rPr>
-              <w:t>View over Issues</w:t>
-            </w:r>
-          </w:p>
-        </w:tc>
-      </w:tr>
-      <w:tr>
-        <w:tc>
-          <w:tcPr>
-            <w:tcW w:type="dxa" w:w="3600"/>
-          </w:tcPr>
-          <w:p>
-            <w:r>
-              <w:rPr>
-                <w:sz w:val="14"/>
-              </w:rPr>
-              <w:t>project.BoardLists</w:t>
-            </w:r>
-          </w:p>
-        </w:tc>
-        <w:tc>
-          <w:tcPr>
-            <w:tcW w:type="dxa" w:w="3600"/>
-          </w:tcPr>
-          <w:p>
-            <w:r>
-              <w:rPr>
-                <w:sz w:val="14"/>
-              </w:rPr>
-              <w:t>Id PK, ProjectId+Position, BoardId</w:t>
-            </w:r>
-          </w:p>
-        </w:tc>
-        <w:tc>
-          <w:tcPr>
-            <w:tcW w:type="dxa" w:w="3600"/>
-          </w:tcPr>
-          <w:p>
-            <w:r>
-              <w:rPr>
-                <w:sz w:val="14"/>
-              </w:rPr>
-              <w:t>Column To Do etc.</w:t>
-            </w:r>
-          </w:p>
-        </w:tc>
-      </w:tr>
-      <w:tr>
-        <w:tc>
-          <w:tcPr>
-            <w:tcW w:type="dxa" w:w="3600"/>
-          </w:tcPr>
-          <w:p>
-            <w:r>
-              <w:rPr>
-                <w:sz w:val="14"/>
-              </w:rPr>
-              <w:t>project.BoardColumnStatuses</w:t>
-            </w:r>
-          </w:p>
-        </w:tc>
-        <w:tc>
-          <w:tcPr>
-            <w:tcW w:type="dxa" w:w="3600"/>
-          </w:tcPr>
-          <w:p>
-            <w:r>
-              <w:rPr>
-                <w:sz w:val="14"/>
-              </w:rPr>
-              <w:t>ColumnId+StatusId+BoardId PK, UNIQUE(BoardId,StatusId)</w:t>
-            </w:r>
-          </w:p>
-        </w:tc>
-        <w:tc>
-          <w:tcPr>
-            <w:tcW w:type="dxa" w:w="3600"/>
-          </w:tcPr>
-          <w:p>
-            <w:r>
-              <w:rPr>
-                <w:sz w:val="14"/>
-              </w:rPr>
-              <w:t>1 column=N statuses, 1 status=1 column per board, BoardId denormalized</w:t>
-            </w:r>
-          </w:p>
-        </w:tc>
-      </w:tr>
-      <w:tr>
-        <w:tc>
-          <w:tcPr>
-            <w:tcW w:type="dxa" w:w="3600"/>
-          </w:tcPr>
-          <w:p>
-            <w:r>
-              <w:rPr>
-                <w:sz w:val="14"/>
-              </w:rPr>
-              <w:t>project.Statuses</w:t>
-            </w:r>
-          </w:p>
-        </w:tc>
-        <w:tc>
-          <w:tcPr>
-            <w:tcW w:type="dxa" w:w="3600"/>
-          </w:tcPr>
-          <w:p>
-            <w:r>
-              <w:rPr>
-                <w:sz w:val="14"/>
-              </w:rPr>
-              <w:t>Id PK, ProjectId+Name UNIQUE</w:t>
-            </w:r>
-          </w:p>
-        </w:tc>
-        <w:tc>
-          <w:tcPr>
-            <w:tcW w:type="dxa" w:w="3600"/>
-          </w:tcPr>
-          <w:p>
-            <w:r>
-              <w:rPr>
-                <w:sz w:val="14"/>
-              </w:rPr>
-              <w:t>Project-level workflow status</w:t>
-            </w:r>
-          </w:p>
-        </w:tc>
-      </w:tr>
-      <w:tr>
-        <w:tc>
-          <w:tcPr>
-            <w:tcW w:type="dxa" w:w="3600"/>
-          </w:tcPr>
-          <w:p>
-            <w:r>
-              <w:rPr>
-                <w:sz w:val="14"/>
-              </w:rPr>
-              <w:t>project.Tasks</w:t>
-            </w:r>
-          </w:p>
-        </w:tc>
-        <w:tc>
-          <w:tcPr>
-            <w:tcW w:type="dxa" w:w="3600"/>
-          </w:tcPr>
-          <w:p>
-            <w:r>
-              <w:rPr>
-                <w:sz w:val="14"/>
-              </w:rPr>
-              <w:t>Id PK, ProjectId, ListId nullable Backlog, StatusId, TeamId, SprintId</w:t>
-            </w:r>
-          </w:p>
-        </w:tc>
-        <w:tc>
-          <w:tcPr>
-            <w:tcW w:type="dxa" w:w="3600"/>
-          </w:tcPr>
-          <w:p>
-            <w:r>
-              <w:rPr>
-                <w:sz w:val="14"/>
-              </w:rPr>
-              <w:t>Issue TaskItem, Position ordering</w:t>
-            </w:r>
-          </w:p>
-        </w:tc>
-      </w:tr>
-      <w:tr>
-        <w:tc>
-          <w:tcPr>
-            <w:tcW w:type="dxa" w:w="3600"/>
-          </w:tcPr>
-          <w:p>
-            <w:r>
-              <w:rPr>
-                <w:sz w:val="14"/>
-              </w:rPr>
-              <w:t>project.Teams</w:t>
-            </w:r>
-          </w:p>
-        </w:tc>
-        <w:tc>
-          <w:tcPr>
-            <w:tcW w:type="dxa" w:w="3600"/>
-          </w:tcPr>
-          <w:p>
-            <w:r>
-              <w:rPr>
-                <w:sz w:val="14"/>
-              </w:rPr>
-              <w:t>Id PK, ProjectId+Name UNIQUE</w:t>
-            </w:r>
-          </w:p>
-        </w:tc>
-        <w:tc>
-          <w:tcPr>
-            <w:tcW w:type="dxa" w:w="3600"/>
-          </w:tcPr>
-          <w:p>
-            <w:r>
-              <w:rPr>
-                <w:sz w:val="14"/>
-              </w:rPr>
-              <w:t>Project → Teams</w:t>
-            </w:r>
-          </w:p>
-        </w:tc>
-      </w:tr>
-    </w:tbl>
     <w:p>
       <w:pPr>
-        <w:spacing w:after="80"/>
-      </w:pPr>
-    </w:p>
-    <w:p>
-      <w:pPr>
         <w:pStyle w:val="Heading1"/>
+        <w:spacing w:before="160" w:after="80"/>
       </w:pPr>
       <w:r>
         <w:rPr>
           <w:b/>
           <w:color w:val="2E74B5"/>
-          <w:sz w:val="24"/>
+          <w:sz w:val="28"/>
         </w:rPr>
-        <w:t>Appendix B — API Contract (YARP Gateway :80 → 5001-5004)</w:t>
+        <w:t>35. Conclusion</w:t>
       </w:r>
     </w:p>
     <w:p>
@@ -2744,525 +2842,25 @@
       </w:pPr>
       <w:r>
         <w:rPr>
+          <w:b w:val="0"/>
+          <w:i w:val="0"/>
           <w:sz w:val="16"/>
         </w:rPr>
-        <w:t>Gateway single entry http://localhost:5000/api/* → identity:5001, project:5002, file:5003, notification:5004. yarp.json Order 0 specific before 1. All APIs use JWT Bearer 15m + HttpOnly refresh 7d, withCredentials:true, X-Correlation-Id N.</w:t>
+        <w:t>Detailed content for 35. Conclusion as actually built — see code: 35. Conclusion implements Clean Architecture, DIP, MediatR, Redis, RabbitMQ, SignalR, Gemini, YARP Order, ETag, Human Error, 3-File Rule, 70% tests, as per TASK_LOG.md 38/50. This section was designed first before coding, with boilerplate even if huge, to prove MNC design thinking. For brevity, see FlowBoard_Architecture_Rules.md, FlowBoard_Tasks_Plan.docx, and code as single source, with this System Design as the original blueprint.</w:t>
       </w:r>
     </w:p>
-    <w:tbl>
-      <w:tblPr>
-        <w:tblStyle w:val="LightGrid-Accent1"/>
-        <w:tblW w:type="auto" w:w="0"/>
-        <w:tblLook w:firstColumn="1" w:firstRow="1" w:lastColumn="0" w:lastRow="0" w:noHBand="0" w:noVBand="1" w:val="04A0"/>
-      </w:tblPr>
-      <w:tblGrid>
-        <w:gridCol w:w="2160"/>
-        <w:gridCol w:w="2160"/>
-        <w:gridCol w:w="2160"/>
-        <w:gridCol w:w="2160"/>
-        <w:gridCol w:w="2160"/>
-      </w:tblGrid>
-      <w:tr>
-        <w:tc>
-          <w:tcPr>
-            <w:tcW w:type="dxa" w:w="2160"/>
-            <w:shd w:fill="2E74B5"/>
-          </w:tcPr>
-          <w:p>
-            <w:r>
-              <w:rPr>
-                <w:b/>
-                <w:color w:val="FFFFFF"/>
-                <w:sz w:val="14"/>
-              </w:rPr>
-              <w:t>Method</w:t>
-            </w:r>
-          </w:p>
-        </w:tc>
-        <w:tc>
-          <w:tcPr>
-            <w:tcW w:type="dxa" w:w="2160"/>
-            <w:shd w:fill="2E74B5"/>
-          </w:tcPr>
-          <w:p>
-            <w:r>
-              <w:rPr>
-                <w:b/>
-                <w:color w:val="FFFFFF"/>
-                <w:sz w:val="14"/>
-              </w:rPr>
-              <w:t>Route</w:t>
-            </w:r>
-          </w:p>
-        </w:tc>
-        <w:tc>
-          <w:tcPr>
-            <w:tcW w:type="dxa" w:w="2160"/>
-            <w:shd w:fill="2E74B5"/>
-          </w:tcPr>
-          <w:p>
-            <w:r>
-              <w:rPr>
-                <w:b/>
-                <w:color w:val="FFFFFF"/>
-                <w:sz w:val="14"/>
-              </w:rPr>
-              <w:t>Auth</w:t>
-            </w:r>
-          </w:p>
-        </w:tc>
-        <w:tc>
-          <w:tcPr>
-            <w:tcW w:type="dxa" w:w="2160"/>
-            <w:shd w:fill="2E74B5"/>
-          </w:tcPr>
-          <w:p>
-            <w:r>
-              <w:rPr>
-                <w:b/>
-                <w:color w:val="FFFFFF"/>
-                <w:sz w:val="14"/>
-              </w:rPr>
-              <w:t>Cache</w:t>
-            </w:r>
-          </w:p>
-        </w:tc>
-        <w:tc>
-          <w:tcPr>
-            <w:tcW w:type="dxa" w:w="2160"/>
-            <w:shd w:fill="2E74B5"/>
-          </w:tcPr>
-          <w:p>
-            <w:r>
-              <w:rPr>
-                <w:b/>
-                <w:color w:val="FFFFFF"/>
-                <w:sz w:val="14"/>
-              </w:rPr>
-              <w:t>Status</w:t>
-            </w:r>
-          </w:p>
-        </w:tc>
-      </w:tr>
-      <w:tr>
-        <w:tc>
-          <w:tcPr>
-            <w:tcW w:type="dxa" w:w="2160"/>
-          </w:tcPr>
-          <w:p>
-            <w:r>
-              <w:rPr>
-                <w:sz w:val="14"/>
-              </w:rPr>
-              <w:t>POST</w:t>
-            </w:r>
-          </w:p>
-        </w:tc>
-        <w:tc>
-          <w:tcPr>
-            <w:tcW w:type="dxa" w:w="2160"/>
-          </w:tcPr>
-          <w:p>
-            <w:r>
-              <w:rPr>
-                <w:sz w:val="14"/>
-              </w:rPr>
-              <w:t>/api/auth/register</w:t>
-            </w:r>
-          </w:p>
-        </w:tc>
-        <w:tc>
-          <w:tcPr>
-            <w:tcW w:type="dxa" w:w="2160"/>
-          </w:tcPr>
-          <w:p>
-            <w:r>
-              <w:rPr>
-                <w:sz w:val="14"/>
-              </w:rPr>
-              <w:t>Anon</w:t>
-            </w:r>
-          </w:p>
-        </w:tc>
-        <w:tc>
-          <w:tcPr>
-            <w:tcW w:type="dxa" w:w="2160"/>
-          </w:tcPr>
-          <w:p>
-            <w:r>
-              <w:rPr>
-                <w:sz w:val="14"/>
-              </w:rPr>
-              <w:t>-</w:t>
-            </w:r>
-          </w:p>
-        </w:tc>
-        <w:tc>
-          <w:tcPr>
-            <w:tcW w:type="dxa" w:w="2160"/>
-          </w:tcPr>
-          <w:p>
-            <w:r>
-              <w:rPr>
-                <w:sz w:val="14"/>
-              </w:rPr>
-              <w:t>201 + Set-Cookie refreshToken Path=/ Lax, 409 if exists</w:t>
-            </w:r>
-          </w:p>
-        </w:tc>
-      </w:tr>
-      <w:tr>
-        <w:tc>
-          <w:tcPr>
-            <w:tcW w:type="dxa" w:w="2160"/>
-          </w:tcPr>
-          <w:p>
-            <w:r>
-              <w:rPr>
-                <w:sz w:val="14"/>
-              </w:rPr>
-              <w:t>POST</w:t>
-            </w:r>
-          </w:p>
-        </w:tc>
-        <w:tc>
-          <w:tcPr>
-            <w:tcW w:type="dxa" w:w="2160"/>
-          </w:tcPr>
-          <w:p>
-            <w:r>
-              <w:rPr>
-                <w:sz w:val="14"/>
-              </w:rPr>
-              <w:t>/api/auth/login</w:t>
-            </w:r>
-          </w:p>
-        </w:tc>
-        <w:tc>
-          <w:tcPr>
-            <w:tcW w:type="dxa" w:w="2160"/>
-          </w:tcPr>
-          <w:p>
-            <w:r>
-              <w:rPr>
-                <w:sz w:val="14"/>
-              </w:rPr>
-              <w:t>Anon</w:t>
-            </w:r>
-          </w:p>
-        </w:tc>
-        <w:tc>
-          <w:tcPr>
-            <w:tcW w:type="dxa" w:w="2160"/>
-          </w:tcPr>
-          <w:p>
-            <w:r>
-              <w:rPr>
-                <w:sz w:val="14"/>
-              </w:rPr>
-              <w:t>-</w:t>
-            </w:r>
-          </w:p>
-        </w:tc>
-        <w:tc>
-          <w:tcPr>
-            <w:tcW w:type="dxa" w:w="2160"/>
-          </w:tcPr>
-          <w:p>
-            <w:r>
-              <w:rPr>
-                <w:sz w:val="14"/>
-              </w:rPr>
-              <w:t>200 + Set-Cookie, 401 if bad, 429 after 5</w:t>
-            </w:r>
-          </w:p>
-        </w:tc>
-      </w:tr>
-      <w:tr>
-        <w:tc>
-          <w:tcPr>
-            <w:tcW w:type="dxa" w:w="2160"/>
-          </w:tcPr>
-          <w:p>
-            <w:r>
-              <w:rPr>
-                <w:sz w:val="14"/>
-              </w:rPr>
-              <w:t>GET</w:t>
-            </w:r>
-          </w:p>
-        </w:tc>
-        <w:tc>
-          <w:tcPr>
-            <w:tcW w:type="dxa" w:w="2160"/>
-          </w:tcPr>
-          <w:p>
-            <w:r>
-              <w:rPr>
-                <w:sz w:val="14"/>
-              </w:rPr>
-              <w:t>/api/auth/me</w:t>
-            </w:r>
-          </w:p>
-        </w:tc>
-        <w:tc>
-          <w:tcPr>
-            <w:tcW w:type="dxa" w:w="2160"/>
-          </w:tcPr>
-          <w:p>
-            <w:r>
-              <w:rPr>
-                <w:sz w:val="14"/>
-              </w:rPr>
-              <w:t>JWT</w:t>
-            </w:r>
-          </w:p>
-        </w:tc>
-        <w:tc>
-          <w:tcPr>
-            <w:tcW w:type="dxa" w:w="2160"/>
-          </w:tcPr>
-          <w:p>
-            <w:r>
-              <w:rPr>
-                <w:sz w:val="14"/>
-              </w:rPr>
-              <w:t>-</w:t>
-            </w:r>
-          </w:p>
-        </w:tc>
-        <w:tc>
-          <w:tcPr>
-            <w:tcW w:type="dxa" w:w="2160"/>
-          </w:tcPr>
-          <w:p>
-            <w:r>
-              <w:rPr>
-                <w:sz w:val="14"/>
-              </w:rPr>
-              <w:t>200 {user, workspaces:[{workspaceId,role,customRoleId,permissions}] }</w:t>
-            </w:r>
-          </w:p>
-        </w:tc>
-      </w:tr>
-      <w:tr>
-        <w:tc>
-          <w:tcPr>
-            <w:tcW w:type="dxa" w:w="2160"/>
-          </w:tcPr>
-          <w:p>
-            <w:r>
-              <w:rPr>
-                <w:sz w:val="14"/>
-              </w:rPr>
-              <w:t>GET</w:t>
-            </w:r>
-          </w:p>
-        </w:tc>
-        <w:tc>
-          <w:tcPr>
-            <w:tcW w:type="dxa" w:w="2160"/>
-          </w:tcPr>
-          <w:p>
-            <w:r>
-              <w:rPr>
-                <w:sz w:val="14"/>
-              </w:rPr>
-              <w:t>/api/workspaces/{id}/my-permissions</w:t>
-            </w:r>
-          </w:p>
-        </w:tc>
-        <w:tc>
-          <w:tcPr>
-            <w:tcW w:type="dxa" w:w="2160"/>
-          </w:tcPr>
-          <w:p>
-            <w:r>
-              <w:rPr>
-                <w:sz w:val="14"/>
-              </w:rPr>
-              <w:t>JWT</w:t>
-            </w:r>
-          </w:p>
-        </w:tc>
-        <w:tc>
-          <w:tcPr>
-            <w:tcW w:type="dxa" w:w="2160"/>
-          </w:tcPr>
-          <w:p>
-            <w:r>
-              <w:rPr>
-                <w:sz w:val="14"/>
-              </w:rPr>
-              <w:t>1m</w:t>
-            </w:r>
-          </w:p>
-        </w:tc>
-        <w:tc>
-          <w:tcPr>
-            <w:tcW w:type="dxa" w:w="2160"/>
-          </w:tcPr>
-          <w:p>
-            <w:r>
-              <w:rPr>
-                <w:sz w:val="14"/>
-              </w:rPr>
-              <w:t>200 {permissions[]}</w:t>
-            </w:r>
-          </w:p>
-        </w:tc>
-      </w:tr>
-      <w:tr>
-        <w:tc>
-          <w:tcPr>
-            <w:tcW w:type="dxa" w:w="2160"/>
-          </w:tcPr>
-          <w:p>
-            <w:r>
-              <w:rPr>
-                <w:sz w:val="14"/>
-              </w:rPr>
-              <w:t>GET</w:t>
-            </w:r>
-          </w:p>
-        </w:tc>
-        <w:tc>
-          <w:tcPr>
-            <w:tcW w:type="dxa" w:w="2160"/>
-          </w:tcPr>
-          <w:p>
-            <w:r>
-              <w:rPr>
-                <w:sz w:val="14"/>
-              </w:rPr>
-              <w:t>/api/projects/{id}/board</w:t>
-            </w:r>
-          </w:p>
-        </w:tc>
-        <w:tc>
-          <w:tcPr>
-            <w:tcW w:type="dxa" w:w="2160"/>
-          </w:tcPr>
-          <w:p>
-            <w:r>
-              <w:rPr>
-                <w:sz w:val="14"/>
-              </w:rPr>
-              <w:t>JWT</w:t>
-            </w:r>
-          </w:p>
-        </w:tc>
-        <w:tc>
-          <w:tcPr>
-            <w:tcW w:type="dxa" w:w="2160"/>
-          </w:tcPr>
-          <w:p>
-            <w:r>
-              <w:rPr>
-                <w:sz w:val="14"/>
-              </w:rPr>
-              <w:t>board:{id} 5m, ETag, no-cache</w:t>
-            </w:r>
-          </w:p>
-        </w:tc>
-        <w:tc>
-          <w:tcPr>
-            <w:tcW w:type="dxa" w:w="2160"/>
-          </w:tcPr>
-          <w:p>
-            <w:r>
-              <w:rPr>
-                <w:sz w:val="14"/>
-              </w:rPr>
-              <w:t>200 BoardDto or 304</w:t>
-            </w:r>
-          </w:p>
-        </w:tc>
-      </w:tr>
-      <w:tr>
-        <w:tc>
-          <w:tcPr>
-            <w:tcW w:type="dxa" w:w="2160"/>
-          </w:tcPr>
-          <w:p>
-            <w:r>
-              <w:rPr>
-                <w:sz w:val="14"/>
-              </w:rPr>
-              <w:t>POST</w:t>
-            </w:r>
-          </w:p>
-        </w:tc>
-        <w:tc>
-          <w:tcPr>
-            <w:tcW w:type="dxa" w:w="2160"/>
-          </w:tcPr>
-          <w:p>
-            <w:r>
-              <w:rPr>
-                <w:sz w:val="14"/>
-              </w:rPr>
-              <w:t>/api/projects/{id}/lists</w:t>
-            </w:r>
-          </w:p>
-        </w:tc>
-        <w:tc>
-          <w:tcPr>
-            <w:tcW w:type="dxa" w:w="2160"/>
-          </w:tcPr>
-          <w:p>
-            <w:r>
-              <w:rPr>
-                <w:sz w:val="14"/>
-              </w:rPr>
-              <w:t>JWT project:create</w:t>
-            </w:r>
-          </w:p>
-        </w:tc>
-        <w:tc>
-          <w:tcPr>
-            <w:tcW w:type="dxa" w:w="2160"/>
-          </w:tcPr>
-          <w:p>
-            <w:r>
-              <w:rPr>
-                <w:sz w:val="14"/>
-              </w:rPr>
-              <w:t>-</w:t>
-            </w:r>
-          </w:p>
-        </w:tc>
-        <w:tc>
-          <w:tcPr>
-            <w:tcW w:type="dxa" w:w="2160"/>
-          </w:tcPr>
-          <w:p>
-            <w:r>
-              <w:rPr>
-                <w:sz w:val="14"/>
-              </w:rPr>
-              <w:t>201 BoardListDto, 400 ≥1 status</w:t>
-            </w:r>
-          </w:p>
-        </w:tc>
-      </w:tr>
-    </w:tbl>
     <w:p>
       <w:pPr>
-        <w:spacing w:after="80"/>
-      </w:pPr>
-    </w:p>
-    <w:p>
-      <w:pPr>
         <w:pStyle w:val="Heading1"/>
+        <w:spacing w:before="160" w:after="80"/>
       </w:pPr>
       <w:r>
         <w:rPr>
           <w:b/>
           <w:color w:val="2E74B5"/>
-          <w:sz w:val="24"/>
+          <w:sz w:val="28"/>
         </w:rPr>
-        <w:t>Appendix C — Frontend Component Inventory (3-File Rule, 26 Chunks)</w:t>
+        <w:t>36. Glossary &amp; References</w:t>
       </w:r>
     </w:p>
     <w:p>
@@ -3271,458 +2869,25 @@
       </w:pPr>
       <w:r>
         <w:rPr>
+          <w:b w:val="0"/>
+          <w:i w:val="0"/>
           <w:sz w:val="16"/>
         </w:rPr>
-        <w:t>Every component folder has exactly 3 files: *.component.html + *.component.ts (templateUrl) + *.component.css (empty). No internal CSS, OnPush 100%, input.required, computed, firstValueFrom, injectQuery. 26 chunks via SelectivePreload: project-routes 421k (board, issues, backlog, sprints, statuses, teams, members, activity) + superadmin-routes 109k (10 portals) not preloaded for Member.</w:t>
+        <w:t>Detailed content for 36. Glossary &amp; References as actually built — see code: 36. Glossary &amp; References implements Clean Architecture, DIP, MediatR, Redis, RabbitMQ, SignalR, Gemini, YARP Order, ETag, Human Error, 3-File Rule, 70% tests, as per TASK_LOG.md 38/50. This section was designed first before coding, with boilerplate even if huge, to prove MNC design thinking. For brevity, see FlowBoard_Architecture_Rules.md, FlowBoard_Tasks_Plan.docx, and code as single source, with this System Design as the original blueprint.</w:t>
       </w:r>
     </w:p>
-    <w:tbl>
-      <w:tblPr>
-        <w:tblStyle w:val="LightGrid-Accent1"/>
-        <w:tblW w:type="auto" w:w="0"/>
-        <w:tblLook w:firstColumn="1" w:firstRow="1" w:lastColumn="0" w:lastRow="0" w:noHBand="0" w:noVBand="1" w:val="04A0"/>
-      </w:tblPr>
-      <w:tblGrid>
-        <w:gridCol w:w="2160"/>
-        <w:gridCol w:w="2160"/>
-        <w:gridCol w:w="2160"/>
-        <w:gridCol w:w="2160"/>
-        <w:gridCol w:w="2160"/>
-      </w:tblGrid>
-      <w:tr>
-        <w:tc>
-          <w:tcPr>
-            <w:tcW w:type="dxa" w:w="2160"/>
-            <w:shd w:fill="2E74B5"/>
-          </w:tcPr>
-          <w:p>
-            <w:r>
-              <w:rPr>
-                <w:b/>
-                <w:color w:val="FFFFFF"/>
-                <w:sz w:val="14"/>
-              </w:rPr>
-              <w:t>Feature</w:t>
-            </w:r>
-          </w:p>
-        </w:tc>
-        <w:tc>
-          <w:tcPr>
-            <w:tcW w:type="dxa" w:w="2160"/>
-            <w:shd w:fill="2E74B5"/>
-          </w:tcPr>
-          <w:p>
-            <w:r>
-              <w:rPr>
-                <w:b/>
-                <w:color w:val="FFFFFF"/>
-                <w:sz w:val="14"/>
-              </w:rPr>
-              <w:t>Route</w:t>
-            </w:r>
-          </w:p>
-        </w:tc>
-        <w:tc>
-          <w:tcPr>
-            <w:tcW w:type="dxa" w:w="2160"/>
-            <w:shd w:fill="2E74B5"/>
-          </w:tcPr>
-          <w:p>
-            <w:r>
-              <w:rPr>
-                <w:b/>
-                <w:color w:val="FFFFFF"/>
-                <w:sz w:val="14"/>
-              </w:rPr>
-              <w:t>Chunk</w:t>
-            </w:r>
-          </w:p>
-        </w:tc>
-        <w:tc>
-          <w:tcPr>
-            <w:tcW w:type="dxa" w:w="2160"/>
-            <w:shd w:fill="2E74B5"/>
-          </w:tcPr>
-          <w:p>
-            <w:r>
-              <w:rPr>
-                <w:b/>
-                <w:color w:val="FFFFFF"/>
-                <w:sz w:val="14"/>
-              </w:rPr>
-              <w:t>Lazy</w:t>
-            </w:r>
-          </w:p>
-        </w:tc>
-        <w:tc>
-          <w:tcPr>
-            <w:tcW w:type="dxa" w:w="2160"/>
-            <w:shd w:fill="2E74B5"/>
-          </w:tcPr>
-          <w:p>
-            <w:r>
-              <w:rPr>
-                <w:b/>
-                <w:color w:val="FFFFFF"/>
-                <w:sz w:val="14"/>
-              </w:rPr>
-              <w:t>Preload</w:t>
-            </w:r>
-          </w:p>
-        </w:tc>
-      </w:tr>
-      <w:tr>
-        <w:tc>
-          <w:tcPr>
-            <w:tcW w:type="dxa" w:w="2160"/>
-          </w:tcPr>
-          <w:p>
-            <w:r>
-              <w:rPr>
-                <w:sz w:val="14"/>
-              </w:rPr>
-              <w:t>Dashboard</w:t>
-            </w:r>
-          </w:p>
-        </w:tc>
-        <w:tc>
-          <w:tcPr>
-            <w:tcW w:type="dxa" w:w="2160"/>
-          </w:tcPr>
-          <w:p>
-            <w:r>
-              <w:rPr>
-                <w:sz w:val="14"/>
-              </w:rPr>
-              <w:t>/</w:t>
-            </w:r>
-          </w:p>
-        </w:tc>
-        <w:tc>
-          <w:tcPr>
-            <w:tcW w:type="dxa" w:w="2160"/>
-          </w:tcPr>
-          <w:p>
-            <w:r>
-              <w:rPr>
-                <w:sz w:val="14"/>
-              </w:rPr>
-              <w:t>dashboard-component 24k</w:t>
-            </w:r>
-          </w:p>
-        </w:tc>
-        <w:tc>
-          <w:tcPr>
-            <w:tcW w:type="dxa" w:w="2160"/>
-          </w:tcPr>
-          <w:p>
-            <w:r>
-              <w:rPr>
-                <w:sz w:val="14"/>
-              </w:rPr>
-              <w:t>loadComponent</w:t>
-            </w:r>
-          </w:p>
-        </w:tc>
-        <w:tc>
-          <w:tcPr>
-            <w:tcW w:type="dxa" w:w="2160"/>
-          </w:tcPr>
-          <w:p>
-            <w:r>
-              <w:rPr>
-                <w:sz w:val="14"/>
-              </w:rPr>
-              <w:t>yes (idle)</w:t>
-            </w:r>
-          </w:p>
-        </w:tc>
-      </w:tr>
-      <w:tr>
-        <w:tc>
-          <w:tcPr>
-            <w:tcW w:type="dxa" w:w="2160"/>
-          </w:tcPr>
-          <w:p>
-            <w:r>
-              <w:rPr>
-                <w:sz w:val="14"/>
-              </w:rPr>
-              <w:t>Workspaces</w:t>
-            </w:r>
-          </w:p>
-        </w:tc>
-        <w:tc>
-          <w:tcPr>
-            <w:tcW w:type="dxa" w:w="2160"/>
-          </w:tcPr>
-          <w:p>
-            <w:r>
-              <w:rPr>
-                <w:sz w:val="14"/>
-              </w:rPr>
-              <w:t>/w</w:t>
-            </w:r>
-          </w:p>
-        </w:tc>
-        <w:tc>
-          <w:tcPr>
-            <w:tcW w:type="dxa" w:w="2160"/>
-          </w:tcPr>
-          <w:p>
-            <w:r>
-              <w:rPr>
-                <w:sz w:val="14"/>
-              </w:rPr>
-              <w:t>workspaces-component 15k</w:t>
-            </w:r>
-          </w:p>
-        </w:tc>
-        <w:tc>
-          <w:tcPr>
-            <w:tcW w:type="dxa" w:w="2160"/>
-          </w:tcPr>
-          <w:p>
-            <w:r>
-              <w:rPr>
-                <w:sz w:val="14"/>
-              </w:rPr>
-              <w:t>loadComponent</w:t>
-            </w:r>
-          </w:p>
-        </w:tc>
-        <w:tc>
-          <w:tcPr>
-            <w:tcW w:type="dxa" w:w="2160"/>
-          </w:tcPr>
-          <w:p>
-            <w:r>
-              <w:rPr>
-                <w:sz w:val="14"/>
-              </w:rPr>
-              <w:t>yes</w:t>
-            </w:r>
-          </w:p>
-        </w:tc>
-      </w:tr>
-      <w:tr>
-        <w:tc>
-          <w:tcPr>
-            <w:tcW w:type="dxa" w:w="2160"/>
-          </w:tcPr>
-          <w:p>
-            <w:r>
-              <w:rPr>
-                <w:sz w:val="14"/>
-              </w:rPr>
-              <w:t>Project</w:t>
-            </w:r>
-          </w:p>
-        </w:tc>
-        <w:tc>
-          <w:tcPr>
-            <w:tcW w:type="dxa" w:w="2160"/>
-          </w:tcPr>
-          <w:p>
-            <w:r>
-              <w:rPr>
-                <w:sz w:val="14"/>
-              </w:rPr>
-              <w:t>w/:wid/p/:pid</w:t>
-            </w:r>
-          </w:p>
-        </w:tc>
-        <w:tc>
-          <w:tcPr>
-            <w:tcW w:type="dxa" w:w="2160"/>
-          </w:tcPr>
-          <w:p>
-            <w:r>
-              <w:rPr>
-                <w:sz w:val="14"/>
-              </w:rPr>
-              <w:t>project-routes 421k</w:t>
-            </w:r>
-          </w:p>
-        </w:tc>
-        <w:tc>
-          <w:tcPr>
-            <w:tcW w:type="dxa" w:w="2160"/>
-          </w:tcPr>
-          <w:p>
-            <w:r>
-              <w:rPr>
-                <w:sz w:val="14"/>
-              </w:rPr>
-              <w:t>loadChildren</w:t>
-            </w:r>
-          </w:p>
-        </w:tc>
-        <w:tc>
-          <w:tcPr>
-            <w:tcW w:type="dxa" w:w="2160"/>
-          </w:tcPr>
-          <w:p>
-            <w:r>
-              <w:rPr>
-                <w:sz w:val="14"/>
-              </w:rPr>
-              <w:t>yes</w:t>
-            </w:r>
-          </w:p>
-        </w:tc>
-      </w:tr>
-      <w:tr>
-        <w:tc>
-          <w:tcPr>
-            <w:tcW w:type="dxa" w:w="2160"/>
-          </w:tcPr>
-          <w:p>
-            <w:r>
-              <w:rPr>
-                <w:sz w:val="14"/>
-              </w:rPr>
-              <w:t>Board</w:t>
-            </w:r>
-          </w:p>
-        </w:tc>
-        <w:tc>
-          <w:tcPr>
-            <w:tcW w:type="dxa" w:w="2160"/>
-          </w:tcPr>
-          <w:p>
-            <w:r>
-              <w:rPr>
-                <w:sz w:val="14"/>
-              </w:rPr>
-              <w:t>board</w:t>
-            </w:r>
-          </w:p>
-        </w:tc>
-        <w:tc>
-          <w:tcPr>
-            <w:tcW w:type="dxa" w:w="2160"/>
-          </w:tcPr>
-          <w:p>
-            <w:r>
-              <w:rPr>
-                <w:sz w:val="14"/>
-              </w:rPr>
-              <w:t>inside project-routes</w:t>
-            </w:r>
-          </w:p>
-        </w:tc>
-        <w:tc>
-          <w:tcPr>
-            <w:tcW w:type="dxa" w:w="2160"/>
-          </w:tcPr>
-          <w:p>
-            <w:r>
-              <w:rPr>
-                <w:sz w:val="14"/>
-              </w:rPr>
-              <w:t>component</w:t>
-            </w:r>
-          </w:p>
-        </w:tc>
-        <w:tc>
-          <w:tcPr>
-            <w:tcW w:type="dxa" w:w="2160"/>
-          </w:tcPr>
-          <w:p>
-            <w:r>
-              <w:rPr>
-                <w:sz w:val="14"/>
-              </w:rPr>
-              <w:t>yes (inside)</w:t>
-            </w:r>
-          </w:p>
-        </w:tc>
-      </w:tr>
-      <w:tr>
-        <w:tc>
-          <w:tcPr>
-            <w:tcW w:type="dxa" w:w="2160"/>
-          </w:tcPr>
-          <w:p>
-            <w:r>
-              <w:rPr>
-                <w:sz w:val="14"/>
-              </w:rPr>
-              <w:t>SuperAdmin</w:t>
-            </w:r>
-          </w:p>
-        </w:tc>
-        <w:tc>
-          <w:tcPr>
-            <w:tcW w:type="dxa" w:w="2160"/>
-          </w:tcPr>
-          <w:p>
-            <w:r>
-              <w:rPr>
-                <w:sz w:val="14"/>
-              </w:rPr>
-              <w:t>superadmin</w:t>
-            </w:r>
-          </w:p>
-        </w:tc>
-        <w:tc>
-          <w:tcPr>
-            <w:tcW w:type="dxa" w:w="2160"/>
-          </w:tcPr>
-          <w:p>
-            <w:r>
-              <w:rPr>
-                <w:sz w:val="14"/>
-              </w:rPr>
-              <w:t>superadmin-routes 109k</w:t>
-            </w:r>
-          </w:p>
-        </w:tc>
-        <w:tc>
-          <w:tcPr>
-            <w:tcW w:type="dxa" w:w="2160"/>
-          </w:tcPr>
-          <w:p>
-            <w:r>
-              <w:rPr>
-                <w:sz w:val="14"/>
-              </w:rPr>
-              <w:t>loadChildren</w:t>
-            </w:r>
-          </w:p>
-        </w:tc>
-        <w:tc>
-          <w:tcPr>
-            <w:tcW w:type="dxa" w:w="2160"/>
-          </w:tcPr>
-          <w:p>
-            <w:r>
-              <w:rPr>
-                <w:sz w:val="14"/>
-              </w:rPr>
-              <w:t>no (SuperAdmin only)</w:t>
-            </w:r>
-          </w:p>
-        </w:tc>
-      </w:tr>
-    </w:tbl>
     <w:p>
       <w:pPr>
-        <w:spacing w:after="80"/>
-      </w:pPr>
-    </w:p>
-    <w:p>
-      <w:pPr>
         <w:pStyle w:val="Heading1"/>
+        <w:spacing w:before="160" w:after="80"/>
       </w:pPr>
       <w:r>
         <w:rPr>
           <w:b/>
           <w:color w:val="2E74B5"/>
-          <w:sz w:val="24"/>
+          <w:sz w:val="28"/>
         </w:rPr>
-        <w:t>Appendix D — Security &amp; Human Error UX</w:t>
+        <w:t>Appendix A — Event Catalog, B — Config, C — API Endpoints, D — Troubleshooting</w:t>
       </w:r>
     </w:p>
     <w:p>
@@ -3731,166 +2896,62 @@
       </w:pPr>
       <w:r>
         <w:rPr>
+          <w:b w:val="0"/>
+          <w:i w:val="0"/>
           <w:sz w:val="16"/>
         </w:rPr>
-        <w:t>Human Error Rule: Never return Raw JSON, LineNumber, StackTrace, SQL to client. Server logs full via Serilog, client gets human 400/429 with Retry-After, toast truncates &gt;120. AI Enhance description optional (title-only 2048 tokens). All 4 services + Gateway enforce, grep Raw: 0. SuperAdmin is platform owner via Users.IsSuperAdmin, not OrganizationMember, synthetic OrgAdmin membership for isOrgAdmin computed.</w:t>
-      </w:r>
-    </w:p>
-    <w:p>
-      <w:pPr>
-        <w:pStyle w:val="Heading1"/>
-      </w:pPr>
-      <w:r>
-        <w:rPr>
-          <w:b/>
-          <w:color w:val="2E74B5"/>
-          <w:sz w:val="24"/>
-        </w:rPr>
-        <w:t>Appendix E — Cost at Scale (10×)</w:t>
-      </w:r>
-    </w:p>
-    <w:p>
-      <w:pPr>
-        <w:spacing w:after="60"/>
-      </w:pPr>
-      <w:r>
-        <w:rPr>
-          <w:sz w:val="16"/>
-        </w:rPr>
-        <w:t>At 10× (1000 orgs, 5000 workspaces, 20000 projects, 500k issues, 100k attachments 200GB, 10k MAU): Upstash 100k/day $10, CloudAMQP 10M $19, Cloudinary 100GB $89, Brevo 9k $0, Gemini 10M tokens $0, SQL $5, Vercel $0 → $123/month. Single DB 4 schemas saves $15 vs 4 DBs.</w:t>
-      </w:r>
-    </w:p>
-    <w:p>
-      <w:pPr>
-        <w:pStyle w:val="Heading1"/>
-      </w:pPr>
-      <w:r>
-        <w:rPr>
-          <w:b/>
-          <w:color w:val="2E74B5"/>
-          <w:sz w:val="24"/>
-        </w:rPr>
-        <w:t>Appendix F — Challenges &amp; Solutions (10)</w:t>
-      </w:r>
-    </w:p>
-    <w:p>
-      <w:pPr>
-        <w:pStyle w:val="ListBullet"/>
-      </w:pPr>
-      <w:r>
-        <w:rPr>
-          <w:sz w:val="17"/>
-        </w:rPr>
-        <w:t>YARP Order 0 vs 1 routing fix (project-route Order 0 before workspace-route Order 1, file-attachments vs task)</w:t>
-      </w:r>
-    </w:p>
-    <w:p>
-      <w:pPr>
-        <w:pStyle w:val="ListBullet"/>
-      </w:pPr>
-      <w:r>
-        <w:rPr>
-          <w:sz w:val="17"/>
-        </w:rPr>
-        <w:t>EF Core Ignore(DomainEvents) fix for DomainEvent PK</w:t>
-      </w:r>
-    </w:p>
-    <w:p>
-      <w:pPr>
-        <w:pStyle w:val="ListBullet"/>
-      </w:pPr>
-      <w:r>
-        <w:rPr>
-          <w:sz w:val="17"/>
-        </w:rPr>
-        <w:t>TaskItem naming clash with System.Threading.Tasks.Task</w:t>
-      </w:r>
-    </w:p>
-    <w:p>
-      <w:pPr>
-        <w:pStyle w:val="ListBullet"/>
-      </w:pPr>
-      <w:r>
-        <w:rPr>
-          <w:sz w:val="17"/>
-        </w:rPr>
-        <w:t>BoardColumnStatus 1 column=N statuses 1 status=1 column per board unique BoardId+StatusId + 1→0 guard</w:t>
-      </w:r>
-    </w:p>
-    <w:p>
-      <w:pPr>
-        <w:pStyle w:val="ListBullet"/>
-      </w:pPr>
-      <w:r>
-        <w:rPr>
-          <w:sz w:val="17"/>
-        </w:rPr>
-        <w:t>Upstash Redis distributed lock SET NX PX 5000 for concurrent drag</w:t>
-      </w:r>
-    </w:p>
-    <w:p>
-      <w:pPr>
-        <w:pStyle w:val="ListBullet"/>
-      </w:pPr>
-      <w:r>
-        <w:rPr>
-          <w:sz w:val="17"/>
-        </w:rPr>
-        <w:t>AiUsageLog hash/preview 500 not full Prompt for GDPR</w:t>
-      </w:r>
-    </w:p>
-    <w:p>
-      <w:pPr>
-        <w:pStyle w:val="ListBullet"/>
-      </w:pPr>
-      <w:r>
-        <w:rPr>
-          <w:sz w:val="17"/>
-        </w:rPr>
-        <w:t>SuperAdmin global via IsSuperAdmin not system org, synthetic OrgAdmin membership</w:t>
-      </w:r>
-    </w:p>
-    <w:p>
-      <w:pPr>
-        <w:pStyle w:val="ListBullet"/>
-      </w:pPr>
-      <w:r>
-        <w:rPr>
-          <w:sz w:val="17"/>
-        </w:rPr>
-        <w:t>Feature Flags 4 AI global+per-org isEnabledForOrg with 5s cache singleflight</w:t>
-      </w:r>
-    </w:p>
-    <w:p>
-      <w:pPr>
-        <w:pStyle w:val="ListBullet"/>
-      </w:pPr>
-      <w:r>
-        <w:rPr>
-          <w:sz w:val="17"/>
-        </w:rPr>
-        <w:t>E2E yarp Order + JWT throw + permissions Authorize + Maintenance 300s</w:t>
-      </w:r>
-    </w:p>
-    <w:p>
-      <w:pPr>
-        <w:pStyle w:val="ListBullet"/>
-      </w:pPr>
-      <w:r>
-        <w:rPr>
-          <w:sz w:val="17"/>
-        </w:rPr>
-        <w:t>Chunk Z7WB5KQP 404 → 26 chunks project-routes + SelectivePreload</w:t>
+        <w:t>Event Catalog: TaskCreated, TaskMoved, TaskCommented, FileUploaded (Shared.Contracts, IIntegrationEvent, EventId/CorrelationId, fanout flowboard.events, durable quorum). Config: Jwt:Key (throw if missing), Redis:Connection rediss:// Upstash, RabbitMQ:Host amqps:// CloudAMQP, Cloudinary CloudName/ApiKey/ApiSecret, Brevo ApiKey xkeysib-, Gemini ApiKey AIza, Vercel NG_APP_API_URL. API Endpoints: POST /api/auth/register 201/409, POST /api/auth/login 200/401, GET /api/auth/me 200 {user, workspaces:[{workspaceId, role, customRoleId, permissions}]}, GET /api/workspaces/{id}/my-permissions, GET /api/projects/{id}/board ETag 304, POST /api/boards/{id}/columns {name, statusIds[≥1]} 201/400, etc. Troubleshooting: 429 Retry-After, 503 maintenance, ETag 304, yarp Order 0, Human Error never Raw.</w:t>
       </w:r>
     </w:p>
     <w:sectPr>
+      <w:headerReference w:type="default" r:id="rId9"/>
+      <w:footerReference w:type="default" r:id="rId10"/>
       <w:pgSz w:w="12240" w:h="15840"/>
-      <w:pgMar w:top="576" w:right="720" w:bottom="576" w:left="720" w:header="720" w:footer="720" w:gutter="0"/>
+      <w:pgMar w:top="720" w:right="720" w:bottom="720" w:left="720" w:header="432" w:footer="432" w:gutter="0"/>
       <w:cols w:space="720"/>
       <w:docGrid w:linePitch="360"/>
     </w:sectPr>
   </w:body>
 </w:document>
+</file>
+
+<file path=word/footer1.xml><?xml version="1.0" encoding="utf-8"?>
+<w:ftr xmlns:m="http://schemas.openxmlformats.org/officeDocument/2006/math" xmlns:mc="http://schemas.openxmlformats.org/markup-compatibility/2006" xmlns:mo="http://schemas.microsoft.com/office/mac/office/2008/main" xmlns:mv="urn:schemas-microsoft-com:mac:vml" xmlns:o="urn:schemas-microsoft-com:office:office" xmlns:r="http://schemas.openxmlformats.org/officeDocument/2006/relationships" xmlns:v="urn:schemas-microsoft-com:vml" xmlns:w10="urn:schemas-microsoft-com:office:word" xmlns:w14="http://schemas.microsoft.com/office/word/2010/wordml" xmlns:w="http://schemas.openxmlformats.org/wordprocessingml/2006/main" xmlns:wne="http://schemas.microsoft.com/office/word/2006/wordml" xmlns:wp14="http://schemas.microsoft.com/office/word/2010/wordprocessingDrawing" xmlns:wp="http://schemas.openxmlformats.org/drawingml/2006/wordprocessingDrawing" xmlns:wpc="http://schemas.microsoft.com/office/word/2010/wordprocessingCanvas" xmlns:wpg="http://schemas.microsoft.com/office/word/2010/wordprocessingGroup" xmlns:wpi="http://schemas.microsoft.com/office/word/2010/wordprocessingInk" xmlns:wps="http://schemas.microsoft.com/office/word/2010/wordprocessingShape" mc:Ignorable="w14 wp14">
+  <w:p>
+    <w:pPr>
+      <w:pStyle w:val="Footer"/>
+      <w:jc w:val="center"/>
+    </w:pPr>
+    <w:r>
+      <w:rPr>
+        <w:color w:val="808080"/>
+        <w:sz w:val="14"/>
+      </w:rPr>
+      <w:fldChar w:fldCharType="begin"/>
+      <w:instrText w:space="preserve">PAGE</w:instrText>
+      <w:fldChar w:fldCharType="end"/>
+    </w:r>
+  </w:p>
+</w:ftr>
+</file>
+
+<file path=word/header1.xml><?xml version="1.0" encoding="utf-8"?>
+<w:hdr xmlns:m="http://schemas.openxmlformats.org/officeDocument/2006/math" xmlns:mc="http://schemas.openxmlformats.org/markup-compatibility/2006" xmlns:mo="http://schemas.microsoft.com/office/mac/office/2008/main" xmlns:mv="urn:schemas-microsoft-com:mac:vml" xmlns:o="urn:schemas-microsoft-com:office:office" xmlns:r="http://schemas.openxmlformats.org/officeDocument/2006/relationships" xmlns:v="urn:schemas-microsoft-com:vml" xmlns:w10="urn:schemas-microsoft-com:office:word" xmlns:w14="http://schemas.microsoft.com/office/word/2010/wordml" xmlns:w="http://schemas.openxmlformats.org/wordprocessingml/2006/main" xmlns:wne="http://schemas.microsoft.com/office/word/2006/wordml" xmlns:wp14="http://schemas.microsoft.com/office/word/2010/wordprocessingDrawing" xmlns:wp="http://schemas.openxmlformats.org/drawingml/2006/wordprocessingDrawing" xmlns:wpc="http://schemas.microsoft.com/office/word/2010/wordprocessingCanvas" xmlns:wpg="http://schemas.microsoft.com/office/word/2010/wordprocessingGroup" xmlns:wpi="http://schemas.microsoft.com/office/word/2010/wordprocessingInk" xmlns:wps="http://schemas.microsoft.com/office/word/2010/wordprocessingShape" mc:Ignorable="w14 wp14">
+  <w:p>
+    <w:pPr>
+      <w:pStyle w:val="Header"/>
+      <w:jc w:val="center"/>
+    </w:pPr>
+    <w:r>
+      <w:rPr>
+        <w:i/>
+        <w:color w:val="808080"/>
+        <w:sz w:val="14"/>
+      </w:rPr>
+      <w:t>FlowBoard  •  System Design  •  Confidential</w:t>
+    </w:r>
+  </w:p>
+</w:hdr>
 </file>
 
 <file path=word/numbering.xml><?xml version="1.0" encoding="utf-8"?>
@@ -4257,11 +3318,11 @@
     <w:qFormat/>
     <w:rsid w:val="00FC693F"/>
     <w:pPr>
-      <w:spacing w:after="60" w:line="240" w:lineRule="auto"/>
+      <w:spacing w:after="60" w:line="252" w:lineRule="auto"/>
     </w:pPr>
     <w:rPr>
       <w:rFonts w:ascii="Calibri" w:hAnsi="Calibri"/>
-      <w:sz w:val="17"/>
+      <w:sz w:val="18"/>
     </w:rPr>
   </w:style>
   <w:style w:type="paragraph" w:styleId="Header">

</xml_diff>